<commit_message>
Builder Review EBM_TLE_br: paper-first; implementation as grounding; update site blurb; regen docx
Made-with: Cursor
</commit_message>
<xml_diff>
--- a/content/EBM_TLE_br.docx
+++ b/content/EBM_TLE_br.docx
@@ -32,9 +32,24 @@
       <w:pPr>
         <w:pStyle w:val="Heading1"/>
       </w:pPr>
-      <w:bookmarkStart w:id="20" w:name="X66f5a01b6edbe06564f05f0b443c1392716b432"/>
-      <w:r>
-        <w:t xml:space="preserve">Builder Review — EBM_TLE (Lopez et al. 2022) + local deployment</w:t>
+      <w:bookmarkStart w:id="20" w:name="Xad4fd28767987b77048cb42fc49570baa34cb26"/>
+      <w:r>
+        <w:t xml:space="preserve">Builder Review —</w:t>
+      </w:r>
+      <w:r>
+        <w:t xml:space="preserve"> </w:t>
+      </w:r>
+      <w:r>
+        <w:rPr>
+          <w:i/>
+        </w:rPr>
+        <w:t xml:space="preserve">Epilepsia</w:t>
+      </w:r>
+      <w:r>
+        <w:t xml:space="preserve"> </w:t>
+      </w:r>
+      <w:r>
+        <w:t xml:space="preserve">KDE EBM in MTLE-HS (Lopez et al. 2022)</w:t>
       </w:r>
       <w:bookmarkEnd w:id="20"/>
     </w:p>
@@ -43,22 +58,133 @@
         <w:pStyle w:val="FirstParagraph"/>
       </w:pPr>
       <w:r>
-        <w:t xml:space="preserve">Evaluation of the</w:t>
-      </w:r>
-      <w:r>
-        <w:t xml:space="preserve"> </w:t>
-      </w:r>
-      <w:r>
-        <w:rPr>
-          <w:i/>
-        </w:rPr>
-        <w:t xml:space="preserve">Epilepsia</w:t>
-      </w:r>
-      <w:r>
-        <w:t xml:space="preserve"> </w:t>
-      </w:r>
-      <w:r>
-        <w:t xml:space="preserve">EBM/MTLE-HS methods paper and this workspace’s implementation, using the</w:t>
+        <w:t xml:space="preserve">This document is a</w:t>
+      </w:r>
+      <w:r>
+        <w:t xml:space="preserve"> </w:t>
+      </w:r>
+      <w:r>
+        <w:rPr>
+          <w:b/>
+        </w:rPr>
+        <w:t xml:space="preserve">Builder Review of the research paper</w:t>
+      </w:r>
+      <w:r>
+        <w:t xml:space="preserve"> </w:t>
+      </w:r>
+      <w:r>
+        <w:t xml:space="preserve">below—its design, evidence, and what a builder should expect when engaging with the same methods. A</w:t>
+      </w:r>
+      <w:r>
+        <w:t xml:space="preserve"> </w:t>
+      </w:r>
+      <w:r>
+        <w:rPr>
+          <w:b/>
+        </w:rPr>
+        <w:t xml:space="preserve">local deployment</w:t>
+      </w:r>
+      <w:r>
+        <w:t xml:space="preserve"> </w:t>
+      </w:r>
+      <w:r>
+        <w:t xml:space="preserve">in this repository (</w:t>
+      </w:r>
+      <w:r>
+        <w:rPr>
+          <w:rStyle w:val="VerbatimChar"/>
+        </w:rPr>
+        <w:t xml:space="preserve">EBM_TLE/</w:t>
+      </w:r>
+      <w:r>
+        <w:t xml:space="preserve">,</w:t>
+      </w:r>
+      <w:r>
+        <w:t xml:space="preserve"> </w:t>
+      </w:r>
+      <w:r>
+        <w:rPr>
+          <w:rStyle w:val="VerbatimChar"/>
+        </w:rPr>
+        <w:t xml:space="preserve">./ebm</w:t>
+      </w:r>
+      <w:r>
+        <w:t xml:space="preserve"> </w:t>
+      </w:r>
+      <w:r>
+        <w:t xml:space="preserve">CLI,</w:t>
+      </w:r>
+      <w:r>
+        <w:t xml:space="preserve"> </w:t>
+      </w:r>
+      <w:r>
+        <w:rPr>
+          <w:rStyle w:val="VerbatimChar"/>
+        </w:rPr>
+        <w:t xml:space="preserve">src/ebm_tle/</w:t>
+      </w:r>
+      <w:r>
+        <w:t xml:space="preserve">) is used to</w:t>
+      </w:r>
+      <w:r>
+        <w:t xml:space="preserve"> </w:t>
+      </w:r>
+      <w:r>
+        <w:rPr>
+          <w:b/>
+        </w:rPr>
+        <w:t xml:space="preserve">ground</w:t>
+      </w:r>
+      <w:r>
+        <w:t xml:space="preserve"> </w:t>
+      </w:r>
+      <w:r>
+        <w:t xml:space="preserve">notes on reproducibility, runtime, and integration. That stack</w:t>
+      </w:r>
+      <w:r>
+        <w:t xml:space="preserve"> </w:t>
+      </w:r>
+      <w:r>
+        <w:rPr>
+          <w:b/>
+        </w:rPr>
+        <w:t xml:space="preserve">helps us write the review</w:t>
+      </w:r>
+      <w:r>
+        <w:t xml:space="preserve">; it is</w:t>
+      </w:r>
+      <w:r>
+        <w:t xml:space="preserve"> </w:t>
+      </w:r>
+      <w:r>
+        <w:rPr>
+          <w:b/>
+        </w:rPr>
+        <w:t xml:space="preserve">not</w:t>
+      </w:r>
+      <w:r>
+        <w:t xml:space="preserve"> </w:t>
+      </w:r>
+      <w:r>
+        <w:t xml:space="preserve">what is being</w:t>
+      </w:r>
+      <w:r>
+        <w:t xml:space="preserve"> </w:t>
+      </w:r>
+      <w:r>
+        <w:t xml:space="preserve">“</w:t>
+      </w:r>
+      <w:r>
+        <w:t xml:space="preserve">reviewed</w:t>
+      </w:r>
+      <w:r>
+        <w:t xml:space="preserve">”</w:t>
+      </w:r>
+      <w:r>
+        <w:t xml:space="preserve"> </w:t>
+      </w:r>
+      <w:r>
+        <w:t xml:space="preserve">in the product sense. The write-up uses the</w:t>
       </w:r>
       <w:r>
         <w:t xml:space="preserve"> </w:t>
@@ -73,7 +199,7 @@
         <w:t xml:space="preserve"> </w:t>
       </w:r>
       <w:r>
-        <w:t xml:space="preserve">style (usability, reproducibility, performance, generalization, clinical use, interpretability, integration, limitations, and builder-oriented conclusions). Full criteria</w:t>
+        <w:t xml:space="preserve">style (e.g. usability, reproducibility, performance, generalization, clinical use, interpretability, integration, limitations, builder-oriented conclusions). Optional full-criteria</w:t>
       </w:r>
       <w:r>
         <w:t xml:space="preserve"> </w:t>
@@ -88,22 +214,7 @@
         <w:t xml:space="preserve"> </w:t>
       </w:r>
       <w:r>
-        <w:t xml:space="preserve">templates, if you use them, can stay</w:t>
-      </w:r>
-      <w:r>
-        <w:t xml:space="preserve"> </w:t>
-      </w:r>
-      <w:r>
-        <w:rPr>
-          <w:b/>
-        </w:rPr>
-        <w:t xml:space="preserve">local</w:t>
-      </w:r>
-      <w:r>
-        <w:t xml:space="preserve"> </w:t>
-      </w:r>
-      <w:r>
-        <w:t xml:space="preserve">only; this Markdown review is what ships in-repo alongside</w:t>
+        <w:t xml:space="preserve">templates, if you use them, can stay local; this file ships in-repo with</w:t>
       </w:r>
       <w:r>
         <w:t xml:space="preserve"> </w:t>
@@ -122,42 +233,161 @@
     </w:p>
     <w:p>
       <w:pPr>
+        <w:pStyle w:val="BlockText"/>
+      </w:pPr>
+      <w:r>
+        <w:rPr>
+          <w:b/>
+        </w:rPr>
+        <w:t xml:space="preserve">Object of the review:</w:t>
+      </w:r>
+      <w:r>
+        <w:t xml:space="preserve"> </w:t>
+      </w:r>
+      <w:r>
+        <w:t xml:space="preserve">the</w:t>
+      </w:r>
+      <w:r>
+        <w:t xml:space="preserve"> </w:t>
+      </w:r>
+      <w:r>
+        <w:rPr>
+          <w:b/>
+        </w:rPr>
+        <w:t xml:space="preserve">publication</w:t>
+      </w:r>
+      <w:r>
+        <w:t xml:space="preserve"> </w:t>
+      </w:r>
+      <w:r>
+        <w:t xml:space="preserve">(Lopez et al. 2022).</w:t>
+      </w:r>
+      <w:r>
+        <w:t xml:space="preserve"> </w:t>
+      </w:r>
+      <w:r>
+        <w:rPr>
+          <w:b/>
+        </w:rPr>
+        <w:t xml:space="preserve">Supporting material:</w:t>
+      </w:r>
+      <w:r>
+        <w:t xml:space="preserve"> </w:t>
+      </w:r>
+      <w:r>
+        <w:t xml:space="preserve">how we</w:t>
+      </w:r>
+      <w:r>
+        <w:t xml:space="preserve"> </w:t>
+      </w:r>
+      <w:r>
+        <w:rPr>
+          <w:b/>
+        </w:rPr>
+        <w:t xml:space="preserve">instantiated the paper’s implied stack</w:t>
+      </w:r>
+      <w:r>
+        <w:t xml:space="preserve"> </w:t>
+      </w:r>
+      <w:r>
+        <w:t xml:space="preserve">in a small, internal shell—narrated only to clarify the paper, not to score a product.</w:t>
+      </w:r>
+    </w:p>
+    <w:p>
+      <w:pPr>
+        <w:pStyle w:val="FirstParagraph"/>
+      </w:pPr>
+      <w:r>
+        <w:rPr>
+          <w:b/>
+        </w:rPr>
+        <w:t xml:space="preserve">Primary reference:</w:t>
+      </w:r>
+      <w:r>
+        <w:t xml:space="preserve"> </w:t>
+      </w:r>
+      <w:r>
+        <w:t xml:space="preserve">Lopez SM, Aksman LM, Oxtoby NP, et al. </w:t>
+      </w:r>
+      <w:r>
+        <w:rPr>
+          <w:i/>
+        </w:rPr>
+        <w:t xml:space="preserve">Event-based modeling in temporal lobe epilepsy demonstrates progressive atrophy from cross-sectional data.</w:t>
+      </w:r>
+      <w:r>
+        <w:t xml:space="preserve"> </w:t>
+      </w:r>
+      <w:r>
+        <w:t xml:space="preserve">Epilepsia. 2022;63(8):2081–2095.</w:t>
+      </w:r>
+      <w:r>
+        <w:t xml:space="preserve"> </w:t>
+      </w:r>
+      <w:hyperlink r:id="rId22">
+        <w:r>
+          <w:rPr>
+            <w:rStyle w:val="Hyperlink"/>
+          </w:rPr>
+          <w:t xml:space="preserve">https://doi.org/10.1111/epi.17316</w:t>
+        </w:r>
+      </w:hyperlink>
+      <w:r>
+        <w:t xml:space="preserve"> </w:t>
+      </w:r>
+      <w:r>
+        <w:t xml:space="preserve">(PMC:</w:t>
+      </w:r>
+      <w:r>
+        <w:t xml:space="preserve"> </w:t>
+      </w:r>
+      <w:hyperlink r:id="rId23">
+        <w:r>
+          <w:rPr>
+            <w:rStyle w:val="Hyperlink"/>
+          </w:rPr>
+          <w:t xml:space="preserve">https://pmc.ncbi.nlm.nih.gov/articles/PMC9540015/</w:t>
+        </w:r>
+      </w:hyperlink>
+      <w:r>
+        <w:t xml:space="preserve">)</w:t>
+      </w:r>
+    </w:p>
+    <w:p>
+      <w:pPr>
         <w:pStyle w:val="BodyText"/>
       </w:pPr>
       <w:r>
         <w:rPr>
           <w:b/>
         </w:rPr>
-        <w:t xml:space="preserve">Primary reference:</w:t>
-      </w:r>
-      <w:r>
-        <w:t xml:space="preserve"> </w:t>
-      </w:r>
-      <w:r>
-        <w:t xml:space="preserve">Lopez SM, Aksman LM, Oxtoby NP, et al. </w:t>
-      </w:r>
-      <w:r>
-        <w:rPr>
-          <w:i/>
-        </w:rPr>
-        <w:t xml:space="preserve">Event-based modeling in temporal lobe epilepsy demonstrates progressive atrophy from cross-sectional data.</w:t>
-      </w:r>
-      <w:r>
-        <w:t xml:space="preserve"> </w:t>
-      </w:r>
-      <w:r>
-        <w:t xml:space="preserve">Epilepsia. 2022;63(8):2081–2095. https://doi.org/10.1111/epi.17316 (PMC: https://pmc.ncbi.nlm.nih.gov/articles/PMC9540015/)</w:t>
-      </w:r>
-    </w:p>
-    <w:p>
-      <w:pPr>
-        <w:pStyle w:val="BodyText"/>
-      </w:pPr>
-      <w:r>
-        <w:rPr>
-          <w:b/>
-        </w:rPr>
-        <w:t xml:space="preserve">Typical local layout:</w:t>
+        <w:t xml:space="preserve">Related in-repo file:</w:t>
+      </w:r>
+      <w:r>
+        <w:t xml:space="preserve"> </w:t>
+      </w:r>
+      <w:hyperlink r:id="rId24">
+        <w:r>
+          <w:rPr>
+            <w:rStyle w:val="Hyperlink"/>
+          </w:rPr>
+          <w:t xml:space="preserve">EBM_TLE.md</w:t>
+        </w:r>
+      </w:hyperlink>
+      <w:r>
+        <w:t xml:space="preserve"> </w:t>
+      </w:r>
+      <w:r>
+        <w:t xml:space="preserve">— short paper summary.</w:t>
+      </w:r>
+      <w:r>
+        <w:t xml:space="preserve"> </w:t>
+      </w:r>
+      <w:r>
+        <w:rPr>
+          <w:b/>
+        </w:rPr>
+        <w:t xml:space="preserve">Typical layout of the grounding code:</w:t>
       </w:r>
       <w:r>
         <w:t xml:space="preserve"> </w:t>
@@ -172,28 +402,16 @@
         <w:t xml:space="preserve"> </w:t>
       </w:r>
       <w:r>
-        <w:t xml:space="preserve">(</w:t>
-      </w:r>
-      <w:r>
-        <w:rPr>
-          <w:rStyle w:val="VerbatimChar"/>
-        </w:rPr>
-        <w:t xml:space="preserve">./ebm</w:t>
-      </w:r>
-      <w:r>
-        <w:t xml:space="preserve"> </w:t>
-      </w:r>
-      <w:r>
-        <w:t xml:space="preserve">CLI,</w:t>
-      </w:r>
-      <w:r>
-        <w:t xml:space="preserve"> </w:t>
-      </w:r>
-      <w:r>
-        <w:rPr>
-          <w:rStyle w:val="VerbatimChar"/>
-        </w:rPr>
-        <w:t xml:space="preserve">src/ebm_tle/</w:t>
+        <w:t xml:space="preserve">(CLI,</w:t>
+      </w:r>
+      <w:r>
+        <w:t xml:space="preserve"> </w:t>
+      </w:r>
+      <w:r>
+        <w:rPr>
+          <w:rStyle w:val="VerbatimChar"/>
+        </w:rPr>
+        <w:t xml:space="preserve">pyproject.toml</w:t>
       </w:r>
       <w:r>
         <w:t xml:space="preserve">,</w:t>
@@ -208,6 +426,48 @@
         <w:t xml:space="preserve">requirements.txt</w:t>
       </w:r>
       <w:r>
+        <w:t xml:space="preserve">);</w:t>
+      </w:r>
+      <w:r>
+        <w:t xml:space="preserve"> </w:t>
+      </w:r>
+      <w:r>
+        <w:rPr>
+          <w:rStyle w:val="VerbatimChar"/>
+        </w:rPr>
+        <w:t xml:space="preserve">pySuStaIn</w:t>
+      </w:r>
+      <w:r>
+        <w:t xml:space="preserve"> </w:t>
+      </w:r>
+      <w:r>
+        <w:t xml:space="preserve">/</w:t>
+      </w:r>
+      <w:r>
+        <w:t xml:space="preserve"> </w:t>
+      </w:r>
+      <w:r>
+        <w:rPr>
+          <w:rStyle w:val="VerbatimChar"/>
+        </w:rPr>
+        <w:t xml:space="preserve">kde_ebm</w:t>
+      </w:r>
+      <w:r>
+        <w:t xml:space="preserve"> </w:t>
+      </w:r>
+      <w:r>
+        <w:t xml:space="preserve">from GitHub; optional</w:t>
+      </w:r>
+      <w:r>
+        <w:t xml:space="preserve"> </w:t>
+      </w:r>
+      <w:r>
+        <w:rPr>
+          <w:rStyle w:val="VerbatimChar"/>
+        </w:rPr>
+        <w:t xml:space="preserve">runs/</w:t>
+      </w:r>
+      <w:r>
         <w:t xml:space="preserve">,</w:t>
       </w:r>
       <w:r>
@@ -217,96 +477,7 @@
         <w:rPr>
           <w:rStyle w:val="VerbatimChar"/>
         </w:rPr>
-        <w:t xml:space="preserve">pyproject.toml</w:t>
-      </w:r>
-      <w:r>
-        <w:t xml:space="preserve">);</w:t>
-      </w:r>
-      <w:r>
-        <w:t xml:space="preserve"> </w:t>
-      </w:r>
-      <w:r>
-        <w:rPr>
-          <w:rStyle w:val="VerbatimChar"/>
-          <w:b/>
-        </w:rPr>
-        <w:t xml:space="preserve">pySuStaIn</w:t>
-      </w:r>
-      <w:r>
-        <w:rPr>
-          <w:b/>
-        </w:rPr>
-        <w:t xml:space="preserve"> </w:t>
-      </w:r>
-      <w:r>
-        <w:rPr>
-          <w:b/>
-        </w:rPr>
-        <w:t xml:space="preserve">/</w:t>
-      </w:r>
-      <w:r>
-        <w:rPr>
-          <w:b/>
-        </w:rPr>
-        <w:t xml:space="preserve"> </w:t>
-      </w:r>
-      <w:r>
-        <w:rPr>
-          <w:rStyle w:val="VerbatimChar"/>
-          <w:b/>
-        </w:rPr>
-        <w:t xml:space="preserve">kde_ebm</w:t>
-      </w:r>
-      <w:r>
-        <w:rPr>
-          <w:b/>
-        </w:rPr>
-        <w:t xml:space="preserve"> </w:t>
-      </w:r>
-      <w:r>
-        <w:rPr>
-          <w:b/>
-        </w:rPr>
-        <w:t xml:space="preserve">from GitHub</w:t>
-      </w:r>
-      <w:r>
-        <w:t xml:space="preserve"> </w:t>
-      </w:r>
-      <w:r>
-        <w:t xml:space="preserve">via pip; optional</w:t>
-      </w:r>
-      <w:r>
-        <w:t xml:space="preserve"> </w:t>
-      </w:r>
-      <w:r>
-        <w:rPr>
-          <w:rStyle w:val="VerbatimChar"/>
-        </w:rPr>
-        <w:t xml:space="preserve">runs/</w:t>
-      </w:r>
-      <w:r>
-        <w:t xml:space="preserve">,</w:t>
-      </w:r>
-      <w:r>
-        <w:t xml:space="preserve"> </w:t>
-      </w:r>
-      <w:r>
-        <w:rPr>
-          <w:rStyle w:val="VerbatimChar"/>
-        </w:rPr>
         <w:t xml:space="preserve">.ebm/logs/</w:t>
-      </w:r>
-      <w:r>
-        <w:t xml:space="preserve">; paper summary in</w:t>
-      </w:r>
-      <w:r>
-        <w:t xml:space="preserve"> </w:t>
-      </w:r>
-      <w:r>
-        <w:rPr>
-          <w:rStyle w:val="VerbatimChar"/>
-        </w:rPr>
-        <w:t xml:space="preserve">EBM_TLE.md</w:t>
       </w:r>
       <w:r>
         <w:t xml:space="preserve">.</w:t>
@@ -323,11 +494,11 @@
       <w:pPr>
         <w:pStyle w:val="Heading2"/>
       </w:pPr>
-      <w:bookmarkStart w:id="22" w:name="context"/>
-      <w:r>
-        <w:t xml:space="preserve">Context</w:t>
-      </w:r>
-      <w:bookmarkEnd w:id="22"/>
+      <w:bookmarkStart w:id="25" w:name="context-what-the-paper-does"/>
+      <w:r>
+        <w:t xml:space="preserve">Context: what the paper does</w:t>
+      </w:r>
+      <w:bookmarkEnd w:id="25"/>
     </w:p>
     <w:p>
       <w:pPr>
@@ -473,7 +644,75 @@
         <w:pStyle w:val="BodyText"/>
       </w:pPr>
       <w:r>
-        <w:t xml:space="preserve">This workspace adds a</w:t>
+        <w:rPr>
+          <w:b/>
+        </w:rPr>
+        <w:t xml:space="preserve">Builder read:</w:t>
+      </w:r>
+      <w:r>
+        <w:t xml:space="preserve"> </w:t>
+      </w:r>
+      <w:r>
+        <w:t xml:space="preserve">the contribution is a clear</w:t>
+      </w:r>
+      <w:r>
+        <w:t xml:space="preserve"> </w:t>
+      </w:r>
+      <w:r>
+        <w:rPr>
+          <w:b/>
+        </w:rPr>
+        <w:t xml:space="preserve">disease–progression</w:t>
+      </w:r>
+      <w:r>
+        <w:t xml:space="preserve"> </w:t>
+      </w:r>
+      <w:r>
+        <w:t xml:space="preserve">story and staging narrative from</w:t>
+      </w:r>
+      <w:r>
+        <w:t xml:space="preserve"> </w:t>
+      </w:r>
+      <w:r>
+        <w:rPr>
+          <w:b/>
+        </w:rPr>
+        <w:t xml:space="preserve">cross-sectional</w:t>
+      </w:r>
+      <w:r>
+        <w:t xml:space="preserve"> </w:t>
+      </w:r>
+      <w:r>
+        <w:t xml:space="preserve">structure, with uncertainty handled as in the publication—not a generic</w:t>
+      </w:r>
+      <w:r>
+        <w:t xml:space="preserve"> </w:t>
+      </w:r>
+      <w:r>
+        <w:t xml:space="preserve">“</w:t>
+      </w:r>
+      <w:r>
+        <w:t xml:space="preserve">tool release.</w:t>
+      </w:r>
+      <w:r>
+        <w:t xml:space="preserve">”</w:t>
+      </w:r>
+    </w:p>
+    <w:p>
+      <w:pPr>
+        <w:pStyle w:val="BodyText"/>
+      </w:pPr>
+      <w:r>
+        <w:rPr>
+          <w:b/>
+        </w:rPr>
+        <w:t xml:space="preserve">Grounding (not a second review object):</w:t>
+      </w:r>
+      <w:r>
+        <w:t xml:space="preserve"> </w:t>
+      </w:r>
+      <w:r>
+        <w:t xml:space="preserve">we use a small</w:t>
       </w:r>
       <w:r>
         <w:t xml:space="preserve"> </w:t>
@@ -485,7 +724,10 @@
         <w:t xml:space="preserve">deployment shell</w:t>
       </w:r>
       <w:r>
-        <w:t xml:space="preserve">: venv +</w:t>
+        <w:t xml:space="preserve"> </w:t>
+      </w:r>
+      <w:r>
+        <w:t xml:space="preserve">here—venv +</w:t>
       </w:r>
       <w:r>
         <w:t xml:space="preserve"> </w:t>
@@ -582,7 +824,49 @@
         <w:t xml:space="preserve">logs</w:t>
       </w:r>
       <w:r>
-        <w:t xml:space="preserve">) and thin wrappers—not a reimplementation of ENIGMA extraction or the paper’s exact mega-analysis.</w:t>
+        <w:t xml:space="preserve">) and thin wrappers—to touch the</w:t>
+      </w:r>
+      <w:r>
+        <w:t xml:space="preserve"> </w:t>
+      </w:r>
+      <w:r>
+        <w:rPr>
+          <w:i/>
+        </w:rPr>
+        <w:t xml:space="preserve">same</w:t>
+      </w:r>
+      <w:r>
+        <w:t xml:space="preserve"> </w:t>
+      </w:r>
+      <w:r>
+        <w:t xml:space="preserve">open stack the paper’s methods point to, not to reproduce ENIGMA extraction or the paper’s full mega-analysis. The next table is</w:t>
+      </w:r>
+      <w:r>
+        <w:t xml:space="preserve"> </w:t>
+      </w:r>
+      <w:r>
+        <w:rPr>
+          <w:b/>
+        </w:rPr>
+        <w:t xml:space="preserve">only</w:t>
+      </w:r>
+      <w:r>
+        <w:t xml:space="preserve"> </w:t>
+      </w:r>
+      <w:r>
+        <w:t xml:space="preserve">“</w:t>
+      </w:r>
+      <w:r>
+        <w:t xml:space="preserve">where the bits live</w:t>
+      </w:r>
+      <w:r>
+        <w:t xml:space="preserve">”</w:t>
+      </w:r>
+      <w:r>
+        <w:t xml:space="preserve"> </w:t>
+      </w:r>
+      <w:r>
+        <w:t xml:space="preserve">when a reader wants to line up the paper with a concrete tree.</w:t>
       </w:r>
     </w:p>
     <w:tbl>
@@ -647,7 +931,7 @@
               <w:jc w:val="left"/>
             </w:pPr>
             <w:r>
-              <w:t xml:space="preserve">Role</w:t>
+              <w:t xml:space="preserve">Role (grounding)</w:t>
             </w:r>
           </w:p>
         </w:tc>
@@ -780,7 +1064,7 @@
               <w:t xml:space="preserve">fit</w:t>
             </w:r>
             <w:r>
-              <w:t xml:space="preserve">, lifecycle commands;</w:t>
+              <w:t xml:space="preserve">, lifecycle;</w:t>
             </w:r>
             <w:r>
               <w:t xml:space="preserve"> </w:t>
@@ -795,7 +1079,7 @@
               <w:t xml:space="preserve"> </w:t>
             </w:r>
             <w:r>
-              <w:t xml:space="preserve">avoids broken</w:t>
+              <w:t xml:space="preserve">works around vendored</w:t>
             </w:r>
             <w:r>
               <w:t xml:space="preserve"> </w:t>
@@ -810,7 +1094,7 @@
               <w:t xml:space="preserve"> </w:t>
             </w:r>
             <w:r>
-              <w:t xml:space="preserve">package imports in upstream pySuStaIn.</w:t>
+              <w:t xml:space="preserve">import issues in upstream pySuStaIn.</w:t>
             </w:r>
           </w:p>
         </w:tc>
@@ -833,12 +1117,12 @@
               <w:pStyle w:val="Compact"/>
               <w:jc w:val="left"/>
             </w:pPr>
-            <w:hyperlink r:id="rId23">
+            <w:hyperlink r:id="rId26">
               <w:r>
                 <w:rPr>
                   <w:rStyle w:val="Hyperlink"/>
                 </w:rPr>
-                <w:t xml:space="preserve">ucl-pond/pySuStaIn</w:t>
+                <w:t xml:space="preserve">pySuStaIn</w:t>
               </w:r>
             </w:hyperlink>
             <w:r>
@@ -847,7 +1131,7 @@
             <w:r>
               <w:t xml:space="preserve"> </w:t>
             </w:r>
-            <w:hyperlink r:id="rId24">
+            <w:hyperlink r:id="rId27">
               <w:r>
                 <w:rPr>
                   <w:rStyle w:val="Hyperlink"/>
@@ -879,7 +1163,7 @@
               <w:t xml:space="preserve"> </w:t>
             </w:r>
             <w:r>
-              <w:t xml:space="preserve">(Git installs).</w:t>
+              <w:t xml:space="preserve">(git installs), matching the paper’s tooling lineage.</w:t>
             </w:r>
           </w:p>
         </w:tc>
@@ -935,7 +1219,7 @@
               <w:t xml:space="preserve">awkde</w:t>
             </w:r>
             <w:r>
-              <w:t xml:space="preserve">, numpy/scipy/sklearn, etc. (git + network on first install).</w:t>
+              <w:t xml:space="preserve">, numpy/scipy/sklearn, etc.</w:t>
             </w:r>
           </w:p>
         </w:tc>
@@ -1044,21 +1328,36 @@
       <w:pPr>
         <w:pStyle w:val="Heading2"/>
       </w:pPr>
-      <w:bookmarkStart w:id="25" w:name="platform-fit-and-reproducibility"/>
-      <w:r>
-        <w:t xml:space="preserve">Platform fit and reproducibility</w:t>
-      </w:r>
-      <w:bookmarkEnd w:id="25"/>
+      <w:bookmarkStart w:id="28" w:name="X853d7df8c998e30d9f72a6c10922dc9b7e6b824"/>
+      <w:r>
+        <w:t xml:space="preserve">Platform fit and reproducibility (paper first)</w:t>
+      </w:r>
+      <w:bookmarkEnd w:id="28"/>
     </w:p>
     <w:p>
       <w:pPr>
         <w:pStyle w:val="Heading3"/>
       </w:pPr>
-      <w:bookmarkStart w:id="26" w:name="usability"/>
-      <w:r>
-        <w:t xml:space="preserve">Usability</w:t>
-      </w:r>
-      <w:bookmarkEnd w:id="26"/>
+      <w:bookmarkStart w:id="29" w:name="what-the-paper-offers"/>
+      <w:r>
+        <w:t xml:space="preserve">What the</w:t>
+      </w:r>
+      <w:r>
+        <w:t xml:space="preserve"> </w:t>
+      </w:r>
+      <w:r>
+        <w:rPr>
+          <w:i/>
+        </w:rPr>
+        <w:t xml:space="preserve">paper</w:t>
+      </w:r>
+      <w:r>
+        <w:t xml:space="preserve"> </w:t>
+      </w:r>
+      <w:r>
+        <w:t xml:space="preserve">offers</w:t>
+      </w:r>
+      <w:bookmarkEnd w:id="29"/>
     </w:p>
     <w:p>
       <w:pPr>
@@ -1068,7 +1367,7 @@
         <w:rPr>
           <w:b/>
         </w:rPr>
-        <w:t xml:space="preserve">Published offering</w:t>
+        <w:t xml:space="preserve">Published study design and claims</w:t>
       </w:r>
     </w:p>
     <w:p>
@@ -1112,7 +1411,41 @@
         <w:rPr>
           <w:b/>
         </w:rPr>
-        <w:t xml:space="preserve">This implementation</w:t>
+        <w:t xml:space="preserve">What a builder can expect when mirroring the</w:t>
+      </w:r>
+      <w:r>
+        <w:rPr>
+          <w:b/>
+        </w:rPr>
+        <w:t xml:space="preserve"> </w:t>
+      </w:r>
+      <w:r>
+        <w:rPr>
+          <w:i/>
+          <w:b/>
+        </w:rPr>
+        <w:t xml:space="preserve">methods</w:t>
+      </w:r>
+      <w:r>
+        <w:rPr>
+          <w:b/>
+        </w:rPr>
+        <w:t xml:space="preserve"> </w:t>
+      </w:r>
+      <w:r>
+        <w:rPr>
+          <w:b/>
+        </w:rPr>
+        <w:t xml:space="preserve">in code</w:t>
+      </w:r>
+      <w:r>
+        <w:t xml:space="preserve"> </w:t>
+      </w:r>
+      <w:r>
+        <w:rPr>
+          <w:i/>
+        </w:rPr>
+        <w:t xml:space="preserve">(illustrative, from our grounding shell; not a product review)</w:t>
       </w:r>
     </w:p>
     <w:p>
@@ -1127,13 +1460,13 @@
         <w:rPr>
           <w:b/>
         </w:rPr>
-        <w:t xml:space="preserve">Strength:</w:t>
-      </w:r>
-      <w:r>
-        <w:t xml:space="preserve"> </w:t>
-      </w:r>
-      <w:r>
-        <w:t xml:space="preserve">One surface after</w:t>
+        <w:t xml:space="preserve">Accessible surface:</w:t>
+      </w:r>
+      <w:r>
+        <w:t xml:space="preserve"> </w:t>
+      </w:r>
+      <w:r>
+        <w:t xml:space="preserve">after</w:t>
       </w:r>
       <w:r>
         <w:t xml:space="preserve"> </w:t>
@@ -1145,7 +1478,7 @@
         <w:t xml:space="preserve">./ebm install</w:t>
       </w:r>
       <w:r>
-        <w:t xml:space="preserve">:</w:t>
+        <w:t xml:space="preserve">, the paper-relevant path can be probed with</w:t>
       </w:r>
       <w:r>
         <w:t xml:space="preserve"> </w:t>
@@ -1187,22 +1520,32 @@
         <w:t xml:space="preserve"> </w:t>
       </w:r>
       <w:r>
-        <w:t xml:space="preserve">(your biomarker table), plus</w:t>
-      </w:r>
-      <w:r>
-        <w:t xml:space="preserve"> </w:t>
-      </w:r>
-      <w:r>
-        <w:rPr>
-          <w:rStyle w:val="VerbatimChar"/>
-        </w:rPr>
-        <w:t xml:space="preserve">./ebm start|stop|logs</w:t>
-      </w:r>
-      <w:r>
-        <w:t xml:space="preserve"> </w:t>
-      </w:r>
-      <w:r>
-        <w:t xml:space="preserve">for background demo runs.</w:t>
+        <w:t xml:space="preserve">(your table), and lifecycle helpers. That informs</w:t>
+      </w:r>
+      <w:r>
+        <w:t xml:space="preserve"> </w:t>
+      </w:r>
+      <w:r>
+        <w:rPr>
+          <w:b/>
+        </w:rPr>
+        <w:t xml:space="preserve">reproducibility and operability of the</w:t>
+      </w:r>
+      <w:r>
+        <w:rPr>
+          <w:b/>
+        </w:rPr>
+        <w:t xml:space="preserve"> </w:t>
+      </w:r>
+      <w:r>
+        <w:rPr>
+          <w:i/>
+          <w:b/>
+        </w:rPr>
+        <w:t xml:space="preserve">methods story</w:t>
+      </w:r>
+      <w:r>
+        <w:t xml:space="preserve">, not a rating of the wrapper as software.</w:t>
       </w:r>
     </w:p>
     <w:p>
@@ -1217,13 +1560,13 @@
         <w:rPr>
           <w:b/>
         </w:rPr>
-        <w:t xml:space="preserve">Friction:</w:t>
-      </w:r>
-      <w:r>
-        <w:t xml:space="preserve"> </w:t>
-      </w:r>
-      <w:r>
-        <w:t xml:space="preserve">First install pulls</w:t>
+        <w:t xml:space="preserve">Cost / friction the paper implies in practice:</w:t>
+      </w:r>
+      <w:r>
+        <w:t xml:space="preserve"> </w:t>
+      </w:r>
+      <w:r>
+        <w:t xml:space="preserve">first install reaches</w:t>
       </w:r>
       <w:r>
         <w:t xml:space="preserve"> </w:t>
@@ -1252,25 +1595,22 @@
         <w:t xml:space="preserve">awkde</w:t>
       </w:r>
       <w:r>
-        <w:t xml:space="preserve"> </w:t>
-      </w:r>
-      <w:r>
-        <w:t xml:space="preserve">from GitHub;</w:t>
-      </w:r>
-      <w:r>
-        <w:t xml:space="preserve"> </w:t>
-      </w:r>
-      <w:r>
-        <w:rPr>
-          <w:b/>
-        </w:rPr>
-        <w:t xml:space="preserve">MCMC wall time</w:t>
-      </w:r>
-      <w:r>
-        <w:t xml:space="preserve"> </w:t>
-      </w:r>
-      <w:r>
-        <w:t xml:space="preserve">grows with</w:t>
+        <w:t xml:space="preserve">;</w:t>
+      </w:r>
+      <w:r>
+        <w:t xml:space="preserve"> </w:t>
+      </w:r>
+      <w:r>
+        <w:rPr>
+          <w:b/>
+        </w:rPr>
+        <w:t xml:space="preserve">MCMC</w:t>
+      </w:r>
+      <w:r>
+        <w:t xml:space="preserve"> </w:t>
+      </w:r>
+      <w:r>
+        <w:t xml:space="preserve">cost scales with</w:t>
       </w:r>
       <w:r>
         <w:t xml:space="preserve"> </w:t>
@@ -1285,7 +1625,34 @@
         <w:t xml:space="preserve"> </w:t>
       </w:r>
       <w:r>
-        <w:t xml:space="preserve">and pySuStaIn’s internal phases—plan for HPC for research-scale iterations.</w:t>
+        <w:t xml:space="preserve">and pySuStaIn’s phases—i.e. the</w:t>
+      </w:r>
+      <w:r>
+        <w:t xml:space="preserve"> </w:t>
+      </w:r>
+      <w:r>
+        <w:rPr>
+          <w:i/>
+        </w:rPr>
+        <w:t xml:space="preserve">paper</w:t>
+      </w:r>
+      <w:r>
+        <w:t xml:space="preserve">’s analysis family is</w:t>
+      </w:r>
+      <w:r>
+        <w:t xml:space="preserve"> </w:t>
+      </w:r>
+      <w:r>
+        <w:rPr>
+          <w:b/>
+        </w:rPr>
+        <w:t xml:space="preserve">compute-heavy</w:t>
+      </w:r>
+      <w:r>
+        <w:t xml:space="preserve"> </w:t>
+      </w:r>
+      <w:r>
+        <w:t xml:space="preserve">relative to a single GLM.</w:t>
       </w:r>
     </w:p>
     <w:p>
@@ -1300,13 +1667,13 @@
         <w:rPr>
           <w:b/>
         </w:rPr>
-        <w:t xml:space="preserve">Hidden steps:</w:t>
-      </w:r>
-      <w:r>
-        <w:t xml:space="preserve"> </w:t>
-      </w:r>
-      <w:r>
-        <w:t xml:space="preserve">Real Lopez-style work still needs</w:t>
+        <w:t xml:space="preserve">Data path the paper still assumes (not replaced here):</w:t>
+      </w:r>
+      <w:r>
+        <w:t xml:space="preserve"> </w:t>
+      </w:r>
+      <w:r>
+        <w:t xml:space="preserve">Lopez-style work needs</w:t>
       </w:r>
       <w:r>
         <w:t xml:space="preserve"> </w:t>
@@ -1321,33 +1688,45 @@
         <w:t xml:space="preserve"> </w:t>
       </w:r>
       <w:r>
-        <w:t xml:space="preserve">regional features (FreeSurfer or equivalent) merged into CSV; this repo does</w:t>
-      </w:r>
-      <w:r>
-        <w:t xml:space="preserve"> </w:t>
-      </w:r>
-      <w:r>
-        <w:rPr>
-          <w:b/>
-        </w:rPr>
-        <w:t xml:space="preserve">not</w:t>
-      </w:r>
-      <w:r>
-        <w:t xml:space="preserve"> </w:t>
-      </w:r>
-      <w:r>
-        <w:t xml:space="preserve">run recon-all.</w:t>
+        <w:t xml:space="preserve">regional features (e.g. FreeSurfer) merged to CSV; that</w:t>
+      </w:r>
+      <w:r>
+        <w:t xml:space="preserve"> </w:t>
+      </w:r>
+      <w:r>
+        <w:rPr>
+          <w:b/>
+        </w:rPr>
+        <w:t xml:space="preserve">feature engineering</w:t>
+      </w:r>
+      <w:r>
+        <w:t xml:space="preserve"> </w:t>
+      </w:r>
+      <w:r>
+        <w:t xml:space="preserve">is where real studies spend effort—the publication’s limits apply, not a limitation</w:t>
+      </w:r>
+      <w:r>
+        <w:t xml:space="preserve"> </w:t>
+      </w:r>
+      <w:r>
+        <w:t xml:space="preserve">“</w:t>
+      </w:r>
+      <w:r>
+        <w:t xml:space="preserve">of the review.</w:t>
+      </w:r>
+      <w:r>
+        <w:t xml:space="preserve">”</w:t>
       </w:r>
     </w:p>
     <w:p>
       <w:pPr>
         <w:pStyle w:val="Heading3"/>
       </w:pPr>
-      <w:bookmarkStart w:id="27" w:name="reproducibility"/>
+      <w:bookmarkStart w:id="30" w:name="reproducibility"/>
       <w:r>
         <w:t xml:space="preserve">Reproducibility</w:t>
       </w:r>
-      <w:bookmarkEnd w:id="27"/>
+      <w:bookmarkEnd w:id="30"/>
     </w:p>
     <w:p>
       <w:pPr>
@@ -1357,7 +1736,32 @@
         <w:rPr>
           <w:b/>
         </w:rPr>
-        <w:t xml:space="preserve">What the paper supports</w:t>
+        <w:t xml:space="preserve">What the paper</w:t>
+      </w:r>
+      <w:r>
+        <w:rPr>
+          <w:b/>
+        </w:rPr>
+        <w:t xml:space="preserve"> </w:t>
+      </w:r>
+      <w:r>
+        <w:rPr>
+          <w:i/>
+          <w:b/>
+        </w:rPr>
+        <w:t xml:space="preserve">supports</w:t>
+      </w:r>
+      <w:r>
+        <w:rPr>
+          <w:b/>
+        </w:rPr>
+        <w:t xml:space="preserve"> </w:t>
+      </w:r>
+      <w:r>
+        <w:rPr>
+          <w:b/>
+        </w:rPr>
+        <w:t xml:space="preserve">for replication</w:t>
       </w:r>
     </w:p>
     <w:p>
@@ -1369,7 +1773,7 @@
         <w:pStyle w:val="Compact"/>
       </w:pPr>
       <w:r>
-        <w:t xml:space="preserve">Fixed methodological story (KDE EBM, ENIGMA features, bootstrap uncertainty in the publication).</w:t>
+        <w:t xml:space="preserve">Fixed methodological account (KDE EBM, ENIGMA features, bootstrap treatment as published).</w:t>
       </w:r>
     </w:p>
     <w:p>
@@ -1380,7 +1784,32 @@
         <w:rPr>
           <w:b/>
         </w:rPr>
-        <w:t xml:space="preserve">Gaps for an external builder</w:t>
+        <w:t xml:space="preserve">What the paper does</w:t>
+      </w:r>
+      <w:r>
+        <w:rPr>
+          <w:b/>
+        </w:rPr>
+        <w:t xml:space="preserve"> </w:t>
+      </w:r>
+      <w:r>
+        <w:rPr>
+          <w:i/>
+          <w:b/>
+        </w:rPr>
+        <w:t xml:space="preserve">not</w:t>
+      </w:r>
+      <w:r>
+        <w:rPr>
+          <w:b/>
+        </w:rPr>
+        <w:t xml:space="preserve"> </w:t>
+      </w:r>
+      <w:r>
+        <w:rPr>
+          <w:b/>
+        </w:rPr>
+        <w:t xml:space="preserve">ship to an external team</w:t>
       </w:r>
     </w:p>
     <w:p>
@@ -1401,28 +1830,13 @@
         <w:rPr>
           <w:b/>
         </w:rPr>
-        <w:t xml:space="preserve">pretrained pickle</w:t>
-      </w:r>
-      <w:r>
-        <w:t xml:space="preserve"> </w:t>
-      </w:r>
-      <w:r>
-        <w:t xml:space="preserve">from the paper; you</w:t>
-      </w:r>
-      <w:r>
-        <w:t xml:space="preserve"> </w:t>
-      </w:r>
-      <w:r>
-        <w:rPr>
-          <w:b/>
-        </w:rPr>
-        <w:t xml:space="preserve">retrain</w:t>
-      </w:r>
-      <w:r>
-        <w:t xml:space="preserve"> </w:t>
-      </w:r>
-      <w:r>
-        <w:t xml:space="preserve">on your CSV/cohort or obtain artifacts from authors if ever shared.</w:t>
+        <w:t xml:space="preserve">pretrained</w:t>
+      </w:r>
+      <w:r>
+        <w:t xml:space="preserve"> </w:t>
+      </w:r>
+      <w:r>
+        <w:t xml:space="preserve">artifact in the public record as a turnkey drop-in; retraining on your table/cohort or author-shared assets is expected.</w:t>
       </w:r>
     </w:p>
     <w:p>
@@ -1434,7 +1848,16 @@
         <w:pStyle w:val="Compact"/>
       </w:pPr>
       <w:r>
-        <w:t xml:space="preserve">End-to-end replication of paper figures requires</w:t>
+        <w:rPr>
+          <w:b/>
+        </w:rPr>
+        <w:t xml:space="preserve">Figure-level</w:t>
+      </w:r>
+      <w:r>
+        <w:t xml:space="preserve"> </w:t>
+      </w:r>
+      <w:r>
+        <w:t xml:space="preserve">match to the original paper needs</w:t>
       </w:r>
       <w:r>
         <w:t xml:space="preserve"> </w:t>
@@ -1449,7 +1872,7 @@
         <w:t xml:space="preserve"> </w:t>
       </w:r>
       <w:r>
-        <w:t xml:space="preserve">data access and their pipelines—not shipped here.</w:t>
+        <w:t xml:space="preserve">data access and their pipelines.</w:t>
       </w:r>
     </w:p>
     <w:p>
@@ -1460,7 +1883,32 @@
         <w:rPr>
           <w:b/>
         </w:rPr>
-        <w:t xml:space="preserve">Observed</w:t>
+        <w:t xml:space="preserve">Builder observation when wiring the</w:t>
+      </w:r>
+      <w:r>
+        <w:rPr>
+          <w:b/>
+        </w:rPr>
+        <w:t xml:space="preserve"> </w:t>
+      </w:r>
+      <w:r>
+        <w:rPr>
+          <w:i/>
+          <w:b/>
+        </w:rPr>
+        <w:t xml:space="preserve">same stack</w:t>
+      </w:r>
+      <w:r>
+        <w:rPr>
+          <w:b/>
+        </w:rPr>
+        <w:t xml:space="preserve"> </w:t>
+      </w:r>
+      <w:r>
+        <w:rPr>
+          <w:b/>
+        </w:rPr>
+        <w:t xml:space="preserve">the paper presupposes</w:t>
       </w:r>
     </w:p>
     <w:p>
@@ -1472,16 +1920,65 @@
         <w:pStyle w:val="Compact"/>
       </w:pPr>
       <w:r>
-        <w:rPr>
-          <w:b/>
-        </w:rPr>
-        <w:t xml:space="preserve">Our deployment</w:t>
-      </w:r>
-      <w:r>
-        <w:t xml:space="preserve"> </w:t>
-      </w:r>
-      <w:r>
-        <w:t xml:space="preserve">reproduces</w:t>
+        <w:t xml:space="preserve">A minimal path can be made</w:t>
+      </w:r>
+      <w:r>
+        <w:t xml:space="preserve"> </w:t>
+      </w:r>
+      <w:r>
+        <w:rPr>
+          <w:b/>
+        </w:rPr>
+        <w:t xml:space="preserve">runnable</w:t>
+      </w:r>
+      <w:r>
+        <w:t xml:space="preserve"> </w:t>
+      </w:r>
+      <w:r>
+        <w:t xml:space="preserve">(imports,</w:t>
+      </w:r>
+      <w:r>
+        <w:t xml:space="preserve"> </w:t>
+      </w:r>
+      <w:r>
+        <w:rPr>
+          <w:b/>
+        </w:rPr>
+        <w:t xml:space="preserve">demo</w:t>
+      </w:r>
+      <w:r>
+        <w:t xml:space="preserve"> </w:t>
+      </w:r>
+      <w:r>
+        <w:t xml:space="preserve">+</w:t>
+      </w:r>
+      <w:r>
+        <w:t xml:space="preserve"> </w:t>
+      </w:r>
+      <w:r>
+        <w:rPr>
+          <w:rStyle w:val="VerbatimChar"/>
+          <w:b/>
+        </w:rPr>
+        <w:t xml:space="preserve">fit</w:t>
+      </w:r>
+      <w:r>
+        <w:t xml:space="preserve">) to</w:t>
+      </w:r>
+      <w:r>
+        <w:t xml:space="preserve"> </w:t>
+      </w:r>
+      <w:r>
+        <w:rPr>
+          <w:b/>
+        </w:rPr>
+        <w:t xml:space="preserve">stress-test</w:t>
+      </w:r>
+      <w:r>
+        <w:t xml:space="preserve"> </w:t>
+      </w:r>
+      <w:r>
+        <w:t xml:space="preserve">the paper’s</w:t>
       </w:r>
       <w:r>
         <w:t xml:space="preserve"> </w:t>
@@ -1490,28 +1987,28 @@
         <w:rPr>
           <w:i/>
         </w:rPr>
-        <w:t xml:space="preserve">runnable infrastructure</w:t>
-      </w:r>
-      <w:r>
-        <w:t xml:space="preserve"> </w:t>
-      </w:r>
-      <w:r>
-        <w:t xml:space="preserve">(imports, demo fit,</w:t>
-      </w:r>
-      <w:r>
-        <w:t xml:space="preserve"> </w:t>
-      </w:r>
-      <w:r>
-        <w:rPr>
-          <w:rStyle w:val="VerbatimChar"/>
-        </w:rPr>
-        <w:t xml:space="preserve">fit</w:t>
-      </w:r>
-      <w:r>
-        <w:t xml:space="preserve"> </w:t>
-      </w:r>
-      <w:r>
-        <w:t xml:space="preserve">path); it does not re-validate paper metrics on ENIGMA data.</w:t>
+        <w:t xml:space="preserve">implicit</w:t>
+      </w:r>
+      <w:r>
+        <w:t xml:space="preserve"> </w:t>
+      </w:r>
+      <w:r>
+        <w:t xml:space="preserve">build burden; that does not re-validate the publication’s</w:t>
+      </w:r>
+      <w:r>
+        <w:t xml:space="preserve"> </w:t>
+      </w:r>
+      <w:r>
+        <w:rPr>
+          <w:i/>
+        </w:rPr>
+        <w:t xml:space="preserve">numerical</w:t>
+      </w:r>
+      <w:r>
+        <w:t xml:space="preserve"> </w:t>
+      </w:r>
+      <w:r>
+        <w:t xml:space="preserve">results on ENIGMA data.</w:t>
       </w:r>
     </w:p>
     <w:p>
@@ -1523,9 +2020,14 @@
         <w:pStyle w:val="Compact"/>
       </w:pPr>
       <w:r>
-        <w:rPr>
-          <w:rStyle w:val="VerbatimChar"/>
-          <w:b/>
+        <w:t xml:space="preserve">A small</w:t>
+      </w:r>
+      <w:r>
+        <w:t xml:space="preserve"> </w:t>
+      </w:r>
+      <w:r>
+        <w:rPr>
+          <w:rStyle w:val="VerbatimChar"/>
         </w:rPr>
         <w:t xml:space="preserve">ebm_tle/synthetic.py</w:t>
       </w:r>
@@ -1533,7 +2035,7 @@
         <w:t xml:space="preserve"> </w:t>
       </w:r>
       <w:r>
-        <w:t xml:space="preserve">replaces vendored</w:t>
+        <w:t xml:space="preserve">workaround addresses vendored</w:t>
       </w:r>
       <w:r>
         <w:t xml:space="preserve"> </w:t>
@@ -1548,34 +2050,28 @@
         <w:t xml:space="preserve"> </w:t>
       </w:r>
       <w:r>
-        <w:t xml:space="preserve">package imports (</w:t>
-      </w:r>
-      <w:r>
-        <w:rPr>
-          <w:rStyle w:val="VerbatimChar"/>
-        </w:rPr>
-        <w:t xml:space="preserve">from simfuncs import *</w:t>
-      </w:r>
-      <w:r>
-        <w:t xml:space="preserve"> </w:t>
-      </w:r>
-      <w:r>
-        <w:t xml:space="preserve">fails when</w:t>
-      </w:r>
-      <w:r>
-        <w:t xml:space="preserve"> </w:t>
-      </w:r>
-      <w:r>
-        <w:rPr>
-          <w:rStyle w:val="VerbatimChar"/>
-        </w:rPr>
-        <w:t xml:space="preserve">sim</w:t>
-      </w:r>
-      <w:r>
-        <w:t xml:space="preserve"> </w:t>
-      </w:r>
-      <w:r>
-        <w:t xml:space="preserve">is installed as a package).</w:t>
+        <w:t xml:space="preserve">import fragility in upstream pySuStaIn when installed as a package—</w:t>
+      </w:r>
+      <w:r>
+        <w:rPr>
+          <w:b/>
+        </w:rPr>
+        <w:t xml:space="preserve">upstream ergonomics</w:t>
+      </w:r>
+      <w:r>
+        <w:t xml:space="preserve">, not a critique of the</w:t>
+      </w:r>
+      <w:r>
+        <w:t xml:space="preserve"> </w:t>
+      </w:r>
+      <w:r>
+        <w:rPr>
+          <w:i/>
+        </w:rPr>
+        <w:t xml:space="preserve">paper</w:t>
+      </w:r>
+      <w:r>
+        <w:t xml:space="preserve">.</w:t>
       </w:r>
     </w:p>
     <w:p>
@@ -1589,21 +2085,33 @@
       <w:pPr>
         <w:pStyle w:val="Heading2"/>
       </w:pPr>
-      <w:bookmarkStart w:id="28" w:name="X71c9e887ed16098e6306ba7d67d4055c5326e05"/>
+      <w:bookmarkStart w:id="31" w:name="X71c9e887ed16098e6306ba7d67d4055c5326e05"/>
       <w:r>
         <w:t xml:space="preserve">Performance, generalization, and comparison</w:t>
       </w:r>
-      <w:bookmarkEnd w:id="28"/>
+      <w:bookmarkEnd w:id="31"/>
     </w:p>
     <w:p>
       <w:pPr>
         <w:pStyle w:val="Heading3"/>
       </w:pPr>
-      <w:bookmarkStart w:id="29" w:name="performance-real-vs-reported"/>
-      <w:r>
-        <w:t xml:space="preserve">Performance (real vs reported)</w:t>
-      </w:r>
-      <w:bookmarkEnd w:id="29"/>
+      <w:bookmarkStart w:id="32" w:name="Xa14bdb92853a379235de0b695cf7c12aecce6a9"/>
+      <w:r>
+        <w:t xml:space="preserve">Performance (as described vs. as experienced when reproducing the</w:t>
+      </w:r>
+      <w:r>
+        <w:t xml:space="preserve"> </w:t>
+      </w:r>
+      <w:r>
+        <w:rPr>
+          <w:i/>
+        </w:rPr>
+        <w:t xml:space="preserve">method</w:t>
+      </w:r>
+      <w:r>
+        <w:t xml:space="preserve">)</w:t>
+      </w:r>
+      <w:bookmarkEnd w:id="32"/>
     </w:p>
     <w:p>
       <w:pPr>
@@ -1625,7 +2133,7 @@
         <w:pStyle w:val="Compact"/>
       </w:pPr>
       <w:r>
-        <w:t xml:space="preserve">Heavy MCMC + bootstrap; multicenter</w:t>
+        <w:t xml:space="preserve">Heavy MCMC + bootstrap; multi-site</w:t>
       </w:r>
       <w:r>
         <w:t xml:space="preserve"> </w:t>
@@ -1637,7 +2145,7 @@
         <w:t xml:space="preserve">N</w:t>
       </w:r>
       <w:r>
-        <w:t xml:space="preserve">; staging and sequence inference are compute-intensive relative to a single GLM.</w:t>
+        <w:t xml:space="preserve">; staging/sequence are compute-intensive vs. a simple regression.</w:t>
       </w:r>
     </w:p>
     <w:p>
@@ -1648,7 +2156,7 @@
         <w:rPr>
           <w:b/>
         </w:rPr>
-        <w:t xml:space="preserve">Builder expectation</w:t>
+        <w:t xml:space="preserve">When exercising a demo aligned with the paper’s stack</w:t>
       </w:r>
     </w:p>
     <w:p>
@@ -1660,17 +2168,10 @@
         <w:pStyle w:val="Compact"/>
       </w:pPr>
       <w:r>
-        <w:t xml:space="preserve">Default</w:t>
-      </w:r>
-      <w:r>
-        <w:t xml:space="preserve"> </w:t>
-      </w:r>
-      <w:r>
-        <w:rPr>
-          <w:rStyle w:val="VerbatimChar"/>
-          <w:b/>
-        </w:rPr>
-        <w:t xml:space="preserve">demo</w:t>
+        <w:rPr>
+          <w:b/>
+        </w:rPr>
+        <w:t xml:space="preserve">Demo</w:t>
       </w:r>
       <w:r>
         <w:t xml:space="preserve"> </w:t>
@@ -1691,37 +2192,44 @@
         <w:t xml:space="preserve"> </w:t>
       </w:r>
       <w:r>
-        <w:t xml:space="preserve">for smoke tests; raise</w:t>
-      </w:r>
-      <w:r>
-        <w:t xml:space="preserve"> </w:t>
-      </w:r>
-      <w:r>
-        <w:rPr>
-          <w:rStyle w:val="VerbatimChar"/>
-          <w:b/>
-        </w:rPr>
-        <w:t xml:space="preserve">--mcmc</w:t>
-      </w:r>
-      <w:r>
-        <w:t xml:space="preserve"> </w:t>
-      </w:r>
-      <w:r>
-        <w:t xml:space="preserve">for analyses meant to align with published practice (longer runs).</w:t>
-      </w:r>
-    </w:p>
-    <w:p>
-      <w:pPr>
-        <w:numPr>
-          <w:ilvl w:val="0"/>
-          <w:numId w:val="1007"/>
-        </w:numPr>
-        <w:pStyle w:val="Compact"/>
-      </w:pPr>
-      <w:r>
-        <w:rPr>
-          <w:rStyle w:val="VerbatimChar"/>
-          <w:b/>
+        <w:t xml:space="preserve">for</w:t>
+      </w:r>
+      <w:r>
+        <w:t xml:space="preserve"> </w:t>
+      </w:r>
+      <w:r>
+        <w:rPr>
+          <w:b/>
+        </w:rPr>
+        <w:t xml:space="preserve">smoke</w:t>
+      </w:r>
+      <w:r>
+        <w:t xml:space="preserve"> </w:t>
+      </w:r>
+      <w:r>
+        <w:t xml:space="preserve">tests;</w:t>
+      </w:r>
+      <w:r>
+        <w:t xml:space="preserve"> </w:t>
+      </w:r>
+      <w:r>
+        <w:rPr>
+          <w:b/>
+        </w:rPr>
+        <w:t xml:space="preserve">longer</w:t>
+      </w:r>
+      <w:r>
+        <w:t xml:space="preserve"> </w:t>
+      </w:r>
+      <w:r>
+        <w:t xml:space="preserve">runs are needed to approach published practice.</w:t>
+      </w:r>
+      <w:r>
+        <w:t xml:space="preserve"> </w:t>
+      </w:r>
+      <w:r>
+        <w:rPr>
+          <w:rStyle w:val="VerbatimChar"/>
         </w:rPr>
         <w:t xml:space="preserve">./ebm check</w:t>
       </w:r>
@@ -1729,33 +2237,30 @@
         <w:t xml:space="preserve"> </w:t>
       </w:r>
       <w:r>
-        <w:t xml:space="preserve">does</w:t>
-      </w:r>
-      <w:r>
-        <w:t xml:space="preserve"> </w:t>
-      </w:r>
-      <w:r>
-        <w:rPr>
-          <w:b/>
-        </w:rPr>
-        <w:t xml:space="preserve">not</w:t>
-      </w:r>
-      <w:r>
-        <w:t xml:space="preserve"> </w:t>
-      </w:r>
-      <w:r>
-        <w:t xml:space="preserve">benchmark MCMC; it validates environment and paths.</w:t>
+        <w:t xml:space="preserve">validates environment, not a bench of the</w:t>
+      </w:r>
+      <w:r>
+        <w:t xml:space="preserve"> </w:t>
+      </w:r>
+      <w:r>
+        <w:rPr>
+          <w:i/>
+        </w:rPr>
+        <w:t xml:space="preserve">paper</w:t>
+      </w:r>
+      <w:r>
+        <w:t xml:space="preserve">’s full MCMC.</w:t>
       </w:r>
     </w:p>
     <w:p>
       <w:pPr>
         <w:pStyle w:val="Heading3"/>
       </w:pPr>
-      <w:bookmarkStart w:id="30" w:name="generalization"/>
-      <w:r>
-        <w:t xml:space="preserve">Generalization</w:t>
-      </w:r>
-      <w:bookmarkEnd w:id="30"/>
+      <w:bookmarkStart w:id="33" w:name="generalization-from-the-paper"/>
+      <w:r>
+        <w:t xml:space="preserve">Generalization (from the paper)</w:t>
+      </w:r>
+      <w:bookmarkEnd w:id="33"/>
     </w:p>
     <w:p>
       <w:pPr>
@@ -1766,66 +2271,60 @@
         <w:pStyle w:val="Compact"/>
       </w:pPr>
       <w:r>
-        <w:t xml:space="preserve">Model ordering and mixtures are</w:t>
-      </w:r>
-      <w:r>
-        <w:t xml:space="preserve"> </w:t>
-      </w:r>
-      <w:r>
-        <w:rPr>
-          <w:b/>
-        </w:rPr>
-        <w:t xml:space="preserve">dataset-specific</w:t>
-      </w:r>
-      <w:r>
-        <w:t xml:space="preserve">; applying a model trained elsewhere requires</w:t>
-      </w:r>
-      <w:r>
-        <w:t xml:space="preserve"> </w:t>
-      </w:r>
-      <w:r>
-        <w:rPr>
-          <w:b/>
-        </w:rPr>
-        <w:t xml:space="preserve">matched</w:t>
-      </w:r>
-      <w:r>
-        <w:t xml:space="preserve"> </w:t>
-      </w:r>
-      <w:r>
-        <w:t xml:space="preserve">biomarker definitions and preprocessing.</w:t>
-      </w:r>
-    </w:p>
-    <w:p>
-      <w:pPr>
-        <w:numPr>
-          <w:ilvl w:val="0"/>
-          <w:numId w:val="1008"/>
-        </w:numPr>
-        <w:pStyle w:val="Compact"/>
-      </w:pPr>
-      <w:r>
-        <w:rPr>
-          <w:b/>
-        </w:rPr>
-        <w:t xml:space="preserve">Site/scanner</w:t>
-      </w:r>
-      <w:r>
-        <w:t xml:space="preserve"> </w:t>
-      </w:r>
-      <w:r>
-        <w:t xml:space="preserve">effects in real morphometry still matter; the paper discusses center heterogeneity (e.g. Stage 0 rates).</w:t>
+        <w:t xml:space="preserve">Orderings and mixtures are</w:t>
+      </w:r>
+      <w:r>
+        <w:t xml:space="preserve"> </w:t>
+      </w:r>
+      <w:r>
+        <w:rPr>
+          <w:b/>
+        </w:rPr>
+        <w:t xml:space="preserve">cohort-specific</w:t>
+      </w:r>
+      <w:r>
+        <w:t xml:space="preserve">; transport requires</w:t>
+      </w:r>
+      <w:r>
+        <w:t xml:space="preserve"> </w:t>
+      </w:r>
+      <w:r>
+        <w:rPr>
+          <w:b/>
+        </w:rPr>
+        <w:t xml:space="preserve">aligned</w:t>
+      </w:r>
+      <w:r>
+        <w:t xml:space="preserve"> </w:t>
+      </w:r>
+      <w:r>
+        <w:t xml:space="preserve">biomarkers and preprocessing.</w:t>
+      </w:r>
+      <w:r>
+        <w:t xml:space="preserve"> </w:t>
+      </w:r>
+      <w:r>
+        <w:rPr>
+          <w:b/>
+        </w:rPr>
+        <w:t xml:space="preserve">Site / scanner</w:t>
+      </w:r>
+      <w:r>
+        <w:t xml:space="preserve"> </w:t>
+      </w:r>
+      <w:r>
+        <w:t xml:space="preserve">effects in morphometry are discussed in the publication (e.g. Stage 0 rates).</w:t>
       </w:r>
     </w:p>
     <w:p>
       <w:pPr>
         <w:pStyle w:val="Heading3"/>
       </w:pPr>
-      <w:bookmarkStart w:id="31" w:name="comparison-to-existing-methods"/>
-      <w:r>
-        <w:t xml:space="preserve">Comparison to existing methods</w:t>
-      </w:r>
-      <w:bookmarkEnd w:id="31"/>
+      <w:bookmarkStart w:id="34" w:name="comparison-to-other-approaches"/>
+      <w:r>
+        <w:t xml:space="preserve">Comparison to other approaches</w:t>
+      </w:r>
+      <w:bookmarkEnd w:id="34"/>
     </w:p>
     <w:p>
       <w:pPr>
@@ -1845,7 +2344,7 @@
         <w:t xml:space="preserve"> </w:t>
       </w:r>
       <w:r>
-        <w:t xml:space="preserve">approaches differ; EBM here is</w:t>
+        <w:t xml:space="preserve">paths differ; this EBM is</w:t>
       </w:r>
       <w:r>
         <w:t xml:space="preserve"> </w:t>
@@ -1860,22 +2359,22 @@
         <w:t xml:space="preserve"> </w:t>
       </w:r>
       <w:r>
-        <w:t xml:space="preserve">under mixture + monotonicity assumptions.</w:t>
-      </w:r>
-      <w:r>
-        <w:t xml:space="preserve"> </w:t>
-      </w:r>
-      <w:r>
-        <w:rPr>
-          <w:b/>
-        </w:rPr>
-        <w:t xml:space="preserve">Builder takeaway:</w:t>
-      </w:r>
-      <w:r>
-        <w:t xml:space="preserve"> </w:t>
-      </w:r>
-      <w:r>
-        <w:t xml:space="preserve">same tooling family as other</w:t>
+        <w:t xml:space="preserve">under the paper’s mixture + monotonicity framing. The</w:t>
+      </w:r>
+      <w:r>
+        <w:t xml:space="preserve"> </w:t>
+      </w:r>
+      <w:r>
+        <w:rPr>
+          <w:b/>
+        </w:rPr>
+        <w:t xml:space="preserve">publication</w:t>
+      </w:r>
+      <w:r>
+        <w:t xml:space="preserve"> </w:t>
+      </w:r>
+      <w:r>
+        <w:t xml:space="preserve">situates the work in the same broad</w:t>
       </w:r>
       <w:r>
         <w:t xml:space="preserve"> </w:t>
@@ -1905,7 +2404,7 @@
         <w:t xml:space="preserve"> </w:t>
       </w:r>
       <w:r>
-        <w:t xml:space="preserve">disease-progression work (e.g. AD), adapted to MTLE-HS morphometry in the publication.</w:t>
+        <w:t xml:space="preserve">line as other progression modeling (e.g. AD) applied here to MTLE-HS.</w:t>
       </w:r>
     </w:p>
     <w:p>
@@ -1919,21 +2418,57 @@
       <w:pPr>
         <w:pStyle w:val="Heading2"/>
       </w:pPr>
-      <w:bookmarkStart w:id="32" w:name="X0f681d1ed324eb165cb7abafaaf9502be529245"/>
+      <w:bookmarkStart w:id="35" w:name="X0f681d1ed324eb165cb7abafaaf9502be529245"/>
       <w:r>
         <w:t xml:space="preserve">Clinical relevance, interpretability, and integration</w:t>
       </w:r>
-      <w:bookmarkEnd w:id="32"/>
+      <w:bookmarkEnd w:id="35"/>
+    </w:p>
+    <w:p>
+      <w:pPr>
+        <w:pStyle w:val="FirstParagraph"/>
+      </w:pPr>
+      <w:r>
+        <w:rPr>
+          <w:i/>
+        </w:rPr>
+        <w:t xml:space="preserve">All points below are about how the</w:t>
+      </w:r>
+      <w:r>
+        <w:rPr>
+          <w:i/>
+        </w:rPr>
+        <w:t xml:space="preserve"> </w:t>
+      </w:r>
+      <w:r>
+        <w:rPr>
+          <w:b/>
+          <w:i/>
+        </w:rPr>
+        <w:t xml:space="preserve">paper</w:t>
+      </w:r>
+      <w:r>
+        <w:rPr>
+          <w:i/>
+        </w:rPr>
+        <w:t xml:space="preserve"> </w:t>
+      </w:r>
+      <w:r>
+        <w:rPr>
+          <w:i/>
+        </w:rPr>
+        <w:t xml:space="preserve">positions staging and use—not an endorsement of any local shell for care.</w:t>
+      </w:r>
     </w:p>
     <w:p>
       <w:pPr>
         <w:pStyle w:val="Heading3"/>
       </w:pPr>
-      <w:bookmarkStart w:id="33" w:name="clinical-relevance"/>
-      <w:r>
-        <w:t xml:space="preserve">Clinical relevance</w:t>
-      </w:r>
-      <w:bookmarkEnd w:id="33"/>
+      <w:bookmarkStart w:id="36" w:name="clinical-relevance-from-the-paper"/>
+      <w:r>
+        <w:t xml:space="preserve">Clinical relevance (from the paper)</w:t>
+      </w:r>
+      <w:bookmarkEnd w:id="36"/>
     </w:p>
     <w:p>
       <w:pPr>
@@ -1953,7 +2488,7 @@
         <w:t xml:space="preserve"> </w:t>
       </w:r>
       <w:r>
-        <w:t xml:space="preserve">Staging and sequence support</w:t>
+        <w:t xml:space="preserve">Staging/sequence for</w:t>
       </w:r>
       <w:r>
         <w:t xml:space="preserve"> </w:t>
@@ -1968,7 +2503,22 @@
         <w:t xml:space="preserve"> </w:t>
       </w:r>
       <w:r>
-        <w:t xml:space="preserve">and cohort description; the paper emphasizes limits of fine-stage vs clinical variables (much of the signal in</w:t>
+        <w:t xml:space="preserve">and description; the paper highlights limits relating fine stages to</w:t>
+      </w:r>
+      <w:r>
+        <w:t xml:space="preserve"> </w:t>
+      </w:r>
+      <w:r>
+        <w:rPr>
+          <w:b/>
+        </w:rPr>
+        <w:t xml:space="preserve">clinical</w:t>
+      </w:r>
+      <w:r>
+        <w:t xml:space="preserve"> </w:t>
+      </w:r>
+      <w:r>
+        <w:t xml:space="preserve">endpoints (much of the signal in</w:t>
       </w:r>
       <w:r>
         <w:t xml:space="preserve"> </w:t>
@@ -2001,33 +2551,33 @@
         <w:t xml:space="preserve"> </w:t>
       </w:r>
       <w:r>
-        <w:t xml:space="preserve">(diagnosis, prognosis, surgical candidacy) is</w:t>
-      </w:r>
-      <w:r>
-        <w:t xml:space="preserve"> </w:t>
-      </w:r>
-      <w:r>
-        <w:rPr>
-          <w:b/>
-        </w:rPr>
-        <w:t xml:space="preserve">out of scope</w:t>
-      </w:r>
-      <w:r>
-        <w:t xml:space="preserve"> </w:t>
-      </w:r>
-      <w:r>
-        <w:t xml:space="preserve">for this repo and under-supported by fine-grained stage–outcome links in that paper.</w:t>
+        <w:t xml:space="preserve">(diagnosis, surgery selection, etc.) is</w:t>
+      </w:r>
+      <w:r>
+        <w:t xml:space="preserve"> </w:t>
+      </w:r>
+      <w:r>
+        <w:rPr>
+          <w:b/>
+        </w:rPr>
+        <w:t xml:space="preserve">not</w:t>
+      </w:r>
+      <w:r>
+        <w:t xml:space="preserve"> </w:t>
+      </w:r>
+      <w:r>
+        <w:t xml:space="preserve">the claim of Lopez et al. in the sense of a regulated device; fine stage–outcome links remain limited in that report.</w:t>
       </w:r>
     </w:p>
     <w:p>
       <w:pPr>
         <w:pStyle w:val="Heading3"/>
       </w:pPr>
-      <w:bookmarkStart w:id="34" w:name="interpretability-and-trust"/>
-      <w:r>
-        <w:t xml:space="preserve">Interpretability and trust</w:t>
-      </w:r>
-      <w:bookmarkEnd w:id="34"/>
+      <w:bookmarkStart w:id="37" w:name="interpretability-and-trust-methods-level"/>
+      <w:r>
+        <w:t xml:space="preserve">Interpretability and trust (methods-level)</w:t>
+      </w:r>
+      <w:bookmarkEnd w:id="37"/>
     </w:p>
     <w:p>
       <w:pPr>
@@ -2041,16 +2591,38 @@
         <w:rPr>
           <w:b/>
         </w:rPr>
-        <w:t xml:space="preserve">Strength:</w:t>
-      </w:r>
-      <w:r>
-        <w:t xml:space="preserve"> </w:t>
-      </w:r>
-      <w:r>
-        <w:t xml:space="preserve">Outputs include</w:t>
-      </w:r>
-      <w:r>
-        <w:t xml:space="preserve"> </w:t>
+        <w:t xml:space="preserve">What’s interpretable in the</w:t>
+      </w:r>
+      <w:r>
+        <w:rPr>
+          <w:b/>
+        </w:rPr>
+        <w:t xml:space="preserve"> </w:t>
+      </w:r>
+      <w:r>
+        <w:rPr>
+          <w:i/>
+          <w:b/>
+        </w:rPr>
+        <w:t xml:space="preserve">paper’s</w:t>
+      </w:r>
+      <w:r>
+        <w:rPr>
+          <w:b/>
+        </w:rPr>
+        <w:t xml:space="preserve"> </w:t>
+      </w:r>
+      <w:r>
+        <w:rPr>
+          <w:b/>
+        </w:rPr>
+        <w:t xml:space="preserve">outputs:</w:t>
+      </w:r>
+      <w:r>
+        <w:t xml:space="preserve"> </w:t>
+      </w:r>
+      <w:r>
+        <w:t xml:space="preserve">e.g. </w:t>
       </w:r>
       <w:r>
         <w:rPr>
@@ -2060,10 +2632,7 @@
         <w:t xml:space="preserve">ml_stage</w:t>
       </w:r>
       <w:r>
-        <w:t xml:space="preserve">, subtype/stage probabilities, and pySuStaIn</w:t>
-      </w:r>
-      <w:r>
-        <w:t xml:space="preserve"> </w:t>
+        <w:t xml:space="preserve">, subtype/stage structure, and companion artifacts the methods describe (e.g. </w:t>
       </w:r>
       <w:r>
         <w:rPr>
@@ -2076,7 +2645,7 @@
         <w:t xml:space="preserve"> </w:t>
       </w:r>
       <w:r>
-        <w:t xml:space="preserve">for inspection with upstream tooling.</w:t>
+        <w:t xml:space="preserve">in the SuStaIn pattern).</w:t>
       </w:r>
     </w:p>
     <w:p>
@@ -2091,39 +2660,63 @@
         <w:rPr>
           <w:b/>
         </w:rPr>
-        <w:t xml:space="preserve">Trust limits:</w:t>
-      </w:r>
-      <w:r>
-        <w:t xml:space="preserve"> </w:t>
-      </w:r>
-      <w:r>
-        <w:t xml:space="preserve">Stages depend on</w:t>
-      </w:r>
-      <w:r>
-        <w:t xml:space="preserve"> </w:t>
-      </w:r>
-      <w:r>
-        <w:rPr>
-          <w:b/>
-        </w:rPr>
-        <w:t xml:space="preserve">KDE separation</w:t>
-      </w:r>
-      <w:r>
-        <w:t xml:space="preserve"> </w:t>
-      </w:r>
-      <w:r>
-        <w:t xml:space="preserve">and chosen biomarkers; bad segmentation or wrong columns in CSV dominate failures.</w:t>
+        <w:t xml:space="preserve">What dominates failure modes:</w:t>
+      </w:r>
+      <w:r>
+        <w:t xml:space="preserve"> </w:t>
+      </w:r>
+      <w:r>
+        <w:t xml:space="preserve">feature quality, segmentation, and table semantics—i.e. </w:t>
+      </w:r>
+      <w:r>
+        <w:rPr>
+          <w:b/>
+        </w:rPr>
+        <w:t xml:space="preserve">measurement and cohort</w:t>
+      </w:r>
+      <w:r>
+        <w:t xml:space="preserve"> </w:t>
+      </w:r>
+      <w:r>
+        <w:t xml:space="preserve">issues, not just</w:t>
+      </w:r>
+      <w:r>
+        <w:t xml:space="preserve"> </w:t>
+      </w:r>
+      <w:r>
+        <w:t xml:space="preserve">“</w:t>
+      </w:r>
+      <w:r>
+        <w:t xml:space="preserve">code bugs.</w:t>
+      </w:r>
+      <w:r>
+        <w:t xml:space="preserve">”</w:t>
       </w:r>
     </w:p>
     <w:p>
       <w:pPr>
         <w:pStyle w:val="Heading3"/>
       </w:pPr>
-      <w:bookmarkStart w:id="35" w:name="integration-potential"/>
-      <w:r>
-        <w:t xml:space="preserve">Integration potential</w:t>
-      </w:r>
-      <w:bookmarkEnd w:id="35"/>
+      <w:bookmarkStart w:id="38" w:name="Xdb3fdd3ffcd6970cd2ca6e8305816ac24d35010"/>
+      <w:r>
+        <w:t xml:space="preserve">Integration (where the</w:t>
+      </w:r>
+      <w:r>
+        <w:t xml:space="preserve"> </w:t>
+      </w:r>
+      <w:r>
+        <w:rPr>
+          <w:i/>
+        </w:rPr>
+        <w:t xml:space="preserve">paper</w:t>
+      </w:r>
+      <w:r>
+        <w:t xml:space="preserve"> </w:t>
+      </w:r>
+      <w:r>
+        <w:t xml:space="preserve">points research workflows)</w:t>
+      </w:r>
+      <w:bookmarkEnd w:id="38"/>
     </w:p>
     <w:p>
       <w:pPr>
@@ -2137,41 +2730,55 @@
         <w:rPr>
           <w:b/>
         </w:rPr>
-        <w:t xml:space="preserve">Research integration:</w:t>
-      </w:r>
-      <w:r>
-        <w:t xml:space="preserve"> </w:t>
-      </w:r>
-      <w:r>
-        <w:t xml:space="preserve">Natural downstream of</w:t>
-      </w:r>
-      <w:r>
-        <w:t xml:space="preserve"> </w:t>
-      </w:r>
-      <w:r>
-        <w:rPr>
-          <w:b/>
-        </w:rPr>
-        <w:t xml:space="preserve">BIDS + FreeSurfer/ENIGMA-style</w:t>
-      </w:r>
-      <w:r>
-        <w:t xml:space="preserve"> </w:t>
-      </w:r>
-      <w:r>
-        <w:t xml:space="preserve">summary tables →</w:t>
-      </w:r>
-      <w:r>
-        <w:t xml:space="preserve"> </w:t>
-      </w:r>
-      <w:r>
-        <w:rPr>
-          <w:rStyle w:val="VerbatimChar"/>
-          <w:b/>
-        </w:rPr>
-        <w:t xml:space="preserve">ebm fit</w:t>
-      </w:r>
-      <w:r>
-        <w:t xml:space="preserve">.</w:t>
+        <w:t xml:space="preserve">Natural research path:</w:t>
+      </w:r>
+      <w:r>
+        <w:t xml:space="preserve"> </w:t>
+      </w:r>
+      <w:r>
+        <w:t xml:space="preserve">BIDS + FreeSurfer/ENIGMA-style summaries</w:t>
+      </w:r>
+      <w:r>
+        <w:t xml:space="preserve"> </w:t>
+      </w:r>
+      <w:r>
+        <w:rPr>
+          <w:b/>
+        </w:rPr>
+        <w:t xml:space="preserve">→</w:t>
+      </w:r>
+      <w:r>
+        <w:t xml:space="preserve"> </w:t>
+      </w:r>
+      <w:r>
+        <w:t xml:space="preserve">a cohort</w:t>
+      </w:r>
+      <w:r>
+        <w:t xml:space="preserve"> </w:t>
+      </w:r>
+      <w:r>
+        <w:rPr>
+          <w:rStyle w:val="VerbatimChar"/>
+        </w:rPr>
+        <w:t xml:space="preserve">fit</w:t>
+      </w:r>
+      <w:r>
+        <w:t xml:space="preserve"> </w:t>
+      </w:r>
+      <w:r>
+        <w:t xml:space="preserve">step on a table—consistent with the</w:t>
+      </w:r>
+      <w:r>
+        <w:t xml:space="preserve"> </w:t>
+      </w:r>
+      <w:r>
+        <w:rPr>
+          <w:i/>
+        </w:rPr>
+        <w:t xml:space="preserve">paper</w:t>
+      </w:r>
+      <w:r>
+        <w:t xml:space="preserve">’s data choice.</w:t>
       </w:r>
     </w:p>
     <w:p>
@@ -2186,13 +2793,43 @@
         <w:rPr>
           <w:b/>
         </w:rPr>
-        <w:t xml:space="preserve">Clinical integration:</w:t>
-      </w:r>
-      <w:r>
-        <w:t xml:space="preserve"> </w:t>
-      </w:r>
-      <w:r>
-        <w:t xml:space="preserve">Not provided; governance and intended-use labeling remain with the deploying institution.</w:t>
+        <w:t xml:space="preserve">Regulated / clinical</w:t>
+      </w:r>
+      <w:r>
+        <w:t xml:space="preserve"> </w:t>
+      </w:r>
+      <w:r>
+        <w:t xml:space="preserve">deployment is a separate design and governance problem from</w:t>
+      </w:r>
+      <w:r>
+        <w:t xml:space="preserve"> </w:t>
+      </w:r>
+      <w:r>
+        <w:rPr>
+          <w:b/>
+        </w:rPr>
+        <w:t xml:space="preserve">reporting</w:t>
+      </w:r>
+      <w:r>
+        <w:t xml:space="preserve"> </w:t>
+      </w:r>
+      <w:r>
+        <w:t xml:space="preserve">the</w:t>
+      </w:r>
+      <w:r>
+        <w:t xml:space="preserve"> </w:t>
+      </w:r>
+      <w:r>
+        <w:rPr>
+          <w:i/>
+        </w:rPr>
+        <w:t xml:space="preserve">Epilepsia</w:t>
+      </w:r>
+      <w:r>
+        <w:t xml:space="preserve"> </w:t>
+      </w:r>
+      <w:r>
+        <w:t xml:space="preserve">methods.</w:t>
       </w:r>
     </w:p>
     <w:p>
@@ -2206,11 +2843,47 @@
       <w:pPr>
         <w:pStyle w:val="Heading2"/>
       </w:pPr>
-      <w:bookmarkStart w:id="36" w:name="limitations-and-failure-modes"/>
-      <w:r>
-        <w:t xml:space="preserve">Limitations and failure modes</w:t>
-      </w:r>
-      <w:bookmarkEnd w:id="36"/>
+      <w:bookmarkStart w:id="39" w:name="limitations-paper-vs.-operational-asides"/>
+      <w:r>
+        <w:t xml:space="preserve">Limitations: paper vs. operational asides</w:t>
+      </w:r>
+      <w:bookmarkEnd w:id="39"/>
+    </w:p>
+    <w:p>
+      <w:pPr>
+        <w:pStyle w:val="FirstParagraph"/>
+      </w:pPr>
+      <w:r>
+        <w:rPr>
+          <w:b/>
+        </w:rPr>
+        <w:t xml:space="preserve">From the</w:t>
+      </w:r>
+      <w:r>
+        <w:rPr>
+          <w:b/>
+        </w:rPr>
+        <w:t xml:space="preserve"> </w:t>
+      </w:r>
+      <w:r>
+        <w:rPr>
+          <w:i/>
+          <w:b/>
+        </w:rPr>
+        <w:t xml:space="preserve">paper</w:t>
+      </w:r>
+      <w:r>
+        <w:rPr>
+          <w:b/>
+        </w:rPr>
+        <w:t xml:space="preserve"> </w:t>
+      </w:r>
+      <w:r>
+        <w:rPr>
+          <w:b/>
+        </w:rPr>
+        <w:t xml:space="preserve">and the methods family</w:t>
+      </w:r>
     </w:p>
     <w:p>
       <w:pPr>
@@ -2221,387 +2894,70 @@
         <w:pStyle w:val="Compact"/>
       </w:pPr>
       <w:r>
-        <w:rPr>
-          <w:b/>
-        </w:rPr>
-        <w:t xml:space="preserve">No imaging pipeline</w:t>
-      </w:r>
-      <w:r>
-        <w:t xml:space="preserve"> </w:t>
-      </w:r>
-      <w:r>
-        <w:t xml:space="preserve">in-repo; CSV quality is the builder’s responsibility.</w:t>
-      </w:r>
-    </w:p>
-    <w:p>
-      <w:pPr>
-        <w:numPr>
-          <w:ilvl w:val="0"/>
-          <w:numId w:val="1013"/>
-        </w:numPr>
-        <w:pStyle w:val="Compact"/>
-      </w:pPr>
-      <w:r>
-        <w:rPr>
-          <w:rStyle w:val="VerbatimChar"/>
-          <w:b/>
-        </w:rPr>
-        <w:t xml:space="preserve">./ebm install</w:t>
-      </w:r>
-      <w:r>
-        <w:t xml:space="preserve"> </w:t>
-      </w:r>
-      <w:r>
-        <w:t xml:space="preserve">needs network access to clone</w:t>
-      </w:r>
-      <w:r>
-        <w:t xml:space="preserve"> </w:t>
-      </w:r>
-      <w:r>
-        <w:rPr>
-          <w:rStyle w:val="VerbatimChar"/>
-          <w:b/>
-        </w:rPr>
-        <w:t xml:space="preserve">pySuStaIn</w:t>
-      </w:r>
-      <w:r>
-        <w:t xml:space="preserve"> </w:t>
-      </w:r>
-      <w:r>
-        <w:t xml:space="preserve">/</w:t>
-      </w:r>
-      <w:r>
-        <w:t xml:space="preserve"> </w:t>
-      </w:r>
-      <w:r>
-        <w:rPr>
-          <w:rStyle w:val="VerbatimChar"/>
-          <w:b/>
-        </w:rPr>
-        <w:t xml:space="preserve">kde_ebm</w:t>
-      </w:r>
-      <w:r>
-        <w:t xml:space="preserve"> </w:t>
-      </w:r>
-      <w:r>
-        <w:t xml:space="preserve">/</w:t>
-      </w:r>
-      <w:r>
-        <w:t xml:space="preserve"> </w:t>
-      </w:r>
-      <w:r>
-        <w:rPr>
-          <w:rStyle w:val="VerbatimChar"/>
-          <w:b/>
-        </w:rPr>
-        <w:t xml:space="preserve">awkde</w:t>
-      </w:r>
-      <w:r>
-        <w:t xml:space="preserve"> </w:t>
-      </w:r>
-      <w:r>
-        <w:t xml:space="preserve">from GitHub.</w:t>
-      </w:r>
-    </w:p>
-    <w:p>
-      <w:pPr>
-        <w:numPr>
-          <w:ilvl w:val="0"/>
-          <w:numId w:val="1013"/>
-        </w:numPr>
-        <w:pStyle w:val="Compact"/>
-      </w:pPr>
-      <w:r>
-        <w:rPr>
-          <w:b/>
-        </w:rPr>
-        <w:t xml:space="preserve">Background</w:t>
-      </w:r>
-      <w:r>
-        <w:rPr>
-          <w:b/>
-        </w:rPr>
-        <w:t xml:space="preserve"> </w:t>
-      </w:r>
-      <w:r>
-        <w:rPr>
-          <w:rStyle w:val="VerbatimChar"/>
-          <w:b/>
-        </w:rPr>
-        <w:t xml:space="preserve">start</w:t>
-      </w:r>
-      <w:r>
-        <w:t xml:space="preserve"> </w:t>
-      </w:r>
-      <w:r>
-        <w:t xml:space="preserve">runs the</w:t>
-      </w:r>
-      <w:r>
-        <w:t xml:space="preserve"> </w:t>
-      </w:r>
-      <w:r>
-        <w:rPr>
-          <w:b/>
-        </w:rPr>
-        <w:t xml:space="preserve">synthetic demo</w:t>
-      </w:r>
-      <w:r>
-        <w:t xml:space="preserve"> </w:t>
-      </w:r>
-      <w:r>
-        <w:t xml:space="preserve">by default—not a generic job queue; change</w:t>
-      </w:r>
-      <w:r>
-        <w:t xml:space="preserve"> </w:t>
-      </w:r>
-      <w:r>
-        <w:rPr>
-          <w:rStyle w:val="VerbatimChar"/>
-        </w:rPr>
-        <w:t xml:space="preserve">cli.cmd_start</w:t>
-      </w:r>
-      <w:r>
-        <w:t xml:space="preserve"> </w:t>
-      </w:r>
-      <w:r>
-        <w:t xml:space="preserve">to background</w:t>
-      </w:r>
-      <w:r>
-        <w:t xml:space="preserve"> </w:t>
-      </w:r>
-      <w:r>
-        <w:rPr>
-          <w:rStyle w:val="VerbatimChar"/>
-          <w:b/>
-        </w:rPr>
-        <w:t xml:space="preserve">fit</w:t>
-      </w:r>
-      <w:r>
-        <w:t xml:space="preserve"> </w:t>
-      </w:r>
-      <w:r>
-        <w:t xml:space="preserve">if needed.</w:t>
-      </w:r>
-    </w:p>
-    <w:p>
-      <w:pPr>
-        <w:numPr>
-          <w:ilvl w:val="0"/>
-          <w:numId w:val="1013"/>
-        </w:numPr>
-        <w:pStyle w:val="Compact"/>
-      </w:pPr>
-      <w:r>
-        <w:rPr>
-          <w:b/>
-        </w:rPr>
-        <w:t xml:space="preserve">Headless:</w:t>
-      </w:r>
-      <w:r>
-        <w:t xml:space="preserve"> </w:t>
-      </w:r>
-      <w:r>
-        <w:t xml:space="preserve">set</w:t>
-      </w:r>
-      <w:r>
-        <w:t xml:space="preserve"> </w:t>
-      </w:r>
-      <w:r>
-        <w:rPr>
-          <w:rStyle w:val="VerbatimChar"/>
-        </w:rPr>
-        <w:t xml:space="preserve">MPLBACKEND=Agg</w:t>
-      </w:r>
-      <w:r>
-        <w:t xml:space="preserve"> </w:t>
-      </w:r>
-      <w:r>
-        <w:t xml:space="preserve">(default in</w:t>
-      </w:r>
-      <w:r>
-        <w:t xml:space="preserve"> </w:t>
-      </w:r>
-      <w:r>
-        <w:rPr>
-          <w:rStyle w:val="VerbatimChar"/>
-        </w:rPr>
-        <w:t xml:space="preserve">./ebm</w:t>
-      </w:r>
-      <w:r>
-        <w:t xml:space="preserve">); plotting in SuStaIn may still touch matplotlib.</w:t>
-      </w:r>
-    </w:p>
-    <w:p>
-      <w:pPr>
-        <w:numPr>
-          <w:ilvl w:val="0"/>
-          <w:numId w:val="1013"/>
-        </w:numPr>
-        <w:pStyle w:val="Compact"/>
-      </w:pPr>
-      <w:r>
-        <w:rPr>
-          <w:b/>
-        </w:rPr>
-        <w:t xml:space="preserve">NFS/home latency</w:t>
-      </w:r>
-      <w:r>
-        <w:t xml:space="preserve"> </w:t>
-      </w:r>
-      <w:r>
-        <w:t xml:space="preserve">can slow venv I/O and large pickle writes; local SSD may help heavy runs.</w:t>
-      </w:r>
-    </w:p>
-    <w:p>
-      <w:r>
-        <w:pict>
-          <v:rect style="width:0;height:1.5pt" o:hralign="center" o:hrstd="t" o:hr="t"/>
-        </w:pict>
-      </w:r>
-    </w:p>
-    <w:p>
-      <w:pPr>
-        <w:pStyle w:val="Heading2"/>
-      </w:pPr>
-      <w:bookmarkStart w:id="37" w:name="builder-insight"/>
-      <w:r>
-        <w:t xml:space="preserve">Builder insight</w:t>
-      </w:r>
-      <w:bookmarkEnd w:id="37"/>
+        <w:t xml:space="preserve">Interpreting stages requires sound</w:t>
+      </w:r>
+      <w:r>
+        <w:t xml:space="preserve"> </w:t>
+      </w:r>
+      <w:r>
+        <w:rPr>
+          <w:b/>
+        </w:rPr>
+        <w:t xml:space="preserve">KDE</w:t>
+      </w:r>
+      <w:r>
+        <w:t xml:space="preserve"> </w:t>
+      </w:r>
+      <w:r>
+        <w:t xml:space="preserve">separation and defensible</w:t>
+      </w:r>
+      <w:r>
+        <w:t xml:space="preserve"> </w:t>
+      </w:r>
+      <w:r>
+        <w:rPr>
+          <w:b/>
+        </w:rPr>
+        <w:t xml:space="preserve">biomarkers</w:t>
+      </w:r>
+      <w:r>
+        <w:t xml:space="preserve">; the publication discusses heterogeneity and limitations on fine clinical mapping.</w:t>
+      </w:r>
     </w:p>
     <w:p>
       <w:pPr>
         <w:pStyle w:val="FirstParagraph"/>
       </w:pPr>
       <w:r>
-        <w:t xml:space="preserve">EBM_TLE is</w:t>
-      </w:r>
-      <w:r>
-        <w:t xml:space="preserve"> </w:t>
-      </w:r>
-      <w:r>
-        <w:rPr>
-          <w:b/>
-        </w:rPr>
-        <w:t xml:space="preserve">strong on wiring the same open stack</w:t>
-      </w:r>
-      <w:r>
-        <w:t xml:space="preserve"> </w:t>
-      </w:r>
-      <w:r>
-        <w:t xml:space="preserve">the paper’s methods imply (</w:t>
-      </w:r>
-      <w:r>
-        <w:rPr>
-          <w:rStyle w:val="VerbatimChar"/>
-          <w:b/>
-        </w:rPr>
-        <w:t xml:space="preserve">kde_ebm</w:t>
-      </w:r>
-      <w:r>
-        <w:rPr>
-          <w:b/>
-        </w:rPr>
-        <w:t xml:space="preserve"> </w:t>
-      </w:r>
-      <w:r>
-        <w:rPr>
-          <w:b/>
-        </w:rPr>
-        <w:t xml:space="preserve">+</w:t>
-      </w:r>
-      <w:r>
-        <w:rPr>
-          <w:b/>
-        </w:rPr>
-        <w:t xml:space="preserve"> </w:t>
-      </w:r>
-      <w:r>
-        <w:rPr>
-          <w:rStyle w:val="VerbatimChar"/>
-          <w:b/>
-        </w:rPr>
-        <w:t xml:space="preserve">MixtureSustain</w:t>
-      </w:r>
-      <w:r>
-        <w:t xml:space="preserve">) into a</w:t>
-      </w:r>
-      <w:r>
-        <w:t xml:space="preserve"> </w:t>
-      </w:r>
-      <w:r>
-        <w:rPr>
-          <w:b/>
-        </w:rPr>
-        <w:t xml:space="preserve">small, operable CLI</w:t>
-      </w:r>
-      <w:r>
-        <w:t xml:space="preserve"> </w:t>
-      </w:r>
-      <w:r>
-        <w:t xml:space="preserve">for internal research. The</w:t>
-      </w:r>
-      <w:r>
-        <w:t xml:space="preserve"> </w:t>
-      </w:r>
-      <w:r>
-        <w:rPr>
-          <w:b/>
-        </w:rPr>
-        <w:t xml:space="preserve">builder gap</w:t>
-      </w:r>
-      <w:r>
-        <w:t xml:space="preserve"> </w:t>
-      </w:r>
-      <w:r>
-        <w:t xml:space="preserve">is</w:t>
-      </w:r>
-      <w:r>
-        <w:t xml:space="preserve"> </w:t>
-      </w:r>
-      <w:r>
-        <w:rPr>
-          <w:b/>
-        </w:rPr>
-        <w:t xml:space="preserve">feature engineering and validation</w:t>
-      </w:r>
-      <w:r>
-        <w:t xml:space="preserve">: building ENIGMA-like tables, choosing biomarkers and |</w:t>
+        <w:rPr>
+          <w:b/>
+        </w:rPr>
+        <w:t xml:space="preserve">Operational notes (from our</w:t>
+      </w:r>
+      <w:r>
+        <w:rPr>
+          <w:b/>
+        </w:rPr>
+        <w:t xml:space="preserve"> </w:t>
       </w:r>
       <w:r>
         <w:rPr>
           <w:i/>
-        </w:rPr>
-        <w:t xml:space="preserve">d</w:t>
-      </w:r>
-      <w:r>
-        <w:t xml:space="preserve">| thresholds, and interpreting stages in light of the paper’s</w:t>
-      </w:r>
-      <w:r>
-        <w:t xml:space="preserve"> </w:t>
-      </w:r>
-      <w:r>
-        <w:rPr>
-          <w:b/>
-        </w:rPr>
-        <w:t xml:space="preserve">Stage 0</w:t>
-      </w:r>
-      <w:r>
-        <w:t xml:space="preserve"> </w:t>
-      </w:r>
-      <w:r>
-        <w:t xml:space="preserve">findings—not installing Python packages.</w:t>
-      </w:r>
-    </w:p>
-    <w:p>
-      <w:pPr>
-        <w:pStyle w:val="BodyText"/>
-      </w:pPr>
-      <w:r>
-        <w:rPr>
-          <w:b/>
-        </w:rPr>
-        <w:t xml:space="preserve">Potential extensions (system-level)</w:t>
+          <w:b/>
+        </w:rPr>
+        <w:t xml:space="preserve">grounding</w:t>
+      </w:r>
+      <w:r>
+        <w:rPr>
+          <w:b/>
+        </w:rPr>
+        <w:t xml:space="preserve"> </w:t>
+      </w:r>
+      <w:r>
+        <w:rPr>
+          <w:b/>
+        </w:rPr>
+        <w:t xml:space="preserve">exercise; illustrative)</w:t>
       </w:r>
     </w:p>
     <w:p>
@@ -2613,50 +2969,28 @@
         <w:pStyle w:val="Compact"/>
       </w:pPr>
       <w:r>
-        <w:t xml:space="preserve">Example</w:t>
-      </w:r>
-      <w:r>
-        <w:t xml:space="preserve"> </w:t>
-      </w:r>
-      <w:r>
-        <w:rPr>
-          <w:rStyle w:val="VerbatimChar"/>
-          <w:b/>
-        </w:rPr>
-        <w:t xml:space="preserve">examples/cohort_template.csv</w:t>
-      </w:r>
-      <w:r>
-        <w:t xml:space="preserve"> </w:t>
-      </w:r>
-      <w:r>
-        <w:t xml:space="preserve">and a</w:t>
-      </w:r>
-      <w:r>
-        <w:t xml:space="preserve"> </w:t>
-      </w:r>
-      <w:r>
-        <w:rPr>
-          <w:b/>
-        </w:rPr>
-        <w:t xml:space="preserve">Makefile</w:t>
-      </w:r>
-      <w:r>
-        <w:t xml:space="preserve"> </w:t>
-      </w:r>
-      <w:r>
-        <w:t xml:space="preserve">target for smoke</w:t>
-      </w:r>
-      <w:r>
-        <w:t xml:space="preserve"> </w:t>
-      </w:r>
-      <w:r>
-        <w:rPr>
-          <w:rStyle w:val="VerbatimChar"/>
-        </w:rPr>
-        <w:t xml:space="preserve">fit</w:t>
-      </w:r>
-      <w:r>
-        <w:t xml:space="preserve">.</w:t>
+        <w:rPr>
+          <w:b/>
+        </w:rPr>
+        <w:t xml:space="preserve">No in-repo imaging pipeline;</w:t>
+      </w:r>
+      <w:r>
+        <w:t xml:space="preserve"> </w:t>
+      </w:r>
+      <w:r>
+        <w:t xml:space="preserve">table construction is the researcher’s job—again aligning with the</w:t>
+      </w:r>
+      <w:r>
+        <w:t xml:space="preserve"> </w:t>
+      </w:r>
+      <w:r>
+        <w:rPr>
+          <w:b/>
+        </w:rPr>
+        <w:t xml:space="preserve">paper</w:t>
+      </w:r>
+      <w:r>
+        <w:t xml:space="preserve">’s reliance on pre-derived ENIGMA-style features.</w:t>
       </w:r>
     </w:p>
     <w:p>
@@ -2671,28 +3005,58 @@
         <w:rPr>
           <w:b/>
         </w:rPr>
-        <w:t xml:space="preserve">Slurm wrapper</w:t>
-      </w:r>
-      <w:r>
-        <w:t xml:space="preserve"> </w:t>
-      </w:r>
-      <w:r>
-        <w:t xml:space="preserve">for long</w:t>
-      </w:r>
-      <w:r>
-        <w:t xml:space="preserve"> </w:t>
-      </w:r>
-      <w:r>
-        <w:rPr>
-          <w:rStyle w:val="VerbatimChar"/>
-        </w:rPr>
-        <w:t xml:space="preserve">fit</w:t>
-      </w:r>
-      <w:r>
-        <w:t xml:space="preserve"> </w:t>
-      </w:r>
-      <w:r>
-        <w:t xml:space="preserve">jobs with frozen</w:t>
+        <w:t xml:space="preserve">Networked install</w:t>
+      </w:r>
+      <w:r>
+        <w:t xml:space="preserve"> </w:t>
+      </w:r>
+      <w:r>
+        <w:t xml:space="preserve">to pull</w:t>
+      </w:r>
+      <w:r>
+        <w:t xml:space="preserve"> </w:t>
+      </w:r>
+      <w:r>
+        <w:rPr>
+          <w:rStyle w:val="VerbatimChar"/>
+        </w:rPr>
+        <w:t xml:space="preserve">pySuStaIn</w:t>
+      </w:r>
+      <w:r>
+        <w:t xml:space="preserve"> </w:t>
+      </w:r>
+      <w:r>
+        <w:t xml:space="preserve">/</w:t>
+      </w:r>
+      <w:r>
+        <w:t xml:space="preserve"> </w:t>
+      </w:r>
+      <w:r>
+        <w:rPr>
+          <w:rStyle w:val="VerbatimChar"/>
+        </w:rPr>
+        <w:t xml:space="preserve">kde_ebm</w:t>
+      </w:r>
+      <w:r>
+        <w:t xml:space="preserve"> </w:t>
+      </w:r>
+      <w:r>
+        <w:t xml:space="preserve">/</w:t>
+      </w:r>
+      <w:r>
+        <w:t xml:space="preserve"> </w:t>
+      </w:r>
+      <w:r>
+        <w:rPr>
+          <w:rStyle w:val="VerbatimChar"/>
+        </w:rPr>
+        <w:t xml:space="preserve">awkde</w:t>
+      </w:r>
+      <w:r>
+        <w:t xml:space="preserve"> </w:t>
+      </w:r>
+      <w:r>
+        <w:t xml:space="preserve">as in</w:t>
       </w:r>
       <w:r>
         <w:t xml:space="preserve"> </w:t>
@@ -2704,10 +3068,7 @@
         <w:t xml:space="preserve">requirements.txt</w:t>
       </w:r>
       <w:r>
-        <w:t xml:space="preserve"> </w:t>
-      </w:r>
-      <w:r>
-        <w:t xml:space="preserve">hash in logs.</w:t>
+        <w:t xml:space="preserve">.</w:t>
       </w:r>
     </w:p>
     <w:p>
@@ -2722,56 +3083,124 @@
         <w:rPr>
           <w:b/>
         </w:rPr>
-        <w:t xml:space="preserve">Optional</w:t>
-      </w:r>
-      <w:r>
-        <w:t xml:space="preserve"> </w:t>
-      </w:r>
-      <w:r>
-        <w:t xml:space="preserve">patch or upstream PR for vendored</w:t>
-      </w:r>
-      <w:r>
-        <w:t xml:space="preserve"> </w:t>
-      </w:r>
-      <w:r>
-        <w:rPr>
-          <w:rStyle w:val="VerbatimChar"/>
-          <w:b/>
-        </w:rPr>
-        <w:t xml:space="preserve">sim</w:t>
-      </w:r>
-      <w:r>
-        <w:t xml:space="preserve"> </w:t>
-      </w:r>
-      <w:r>
-        <w:t xml:space="preserve">package imports (use relative</w:t>
-      </w:r>
-      <w:r>
-        <w:t xml:space="preserve"> </w:t>
-      </w:r>
-      <w:r>
-        <w:rPr>
-          <w:rStyle w:val="VerbatimChar"/>
-        </w:rPr>
-        <w:t xml:space="preserve">from .simfuncs import *</w:t>
-      </w:r>
-      <w:r>
-        <w:t xml:space="preserve">) so</w:t>
-      </w:r>
-      <w:r>
-        <w:t xml:space="preserve"> </w:t>
-      </w:r>
-      <w:r>
-        <w:rPr>
-          <w:rStyle w:val="VerbatimChar"/>
-        </w:rPr>
-        <w:t xml:space="preserve">synthetic.py</w:t>
-      </w:r>
-      <w:r>
-        <w:t xml:space="preserve"> </w:t>
-      </w:r>
-      <w:r>
-        <w:t xml:space="preserve">could be retired.</w:t>
+        <w:t xml:space="preserve">Background</w:t>
+      </w:r>
+      <w:r>
+        <w:t xml:space="preserve"> </w:t>
+      </w:r>
+      <w:r>
+        <w:rPr>
+          <w:rStyle w:val="VerbatimChar"/>
+        </w:rPr>
+        <w:t xml:space="preserve">start</w:t>
+      </w:r>
+      <w:r>
+        <w:t xml:space="preserve"> </w:t>
+      </w:r>
+      <w:r>
+        <w:t xml:space="preserve">in this tree runs the</w:t>
+      </w:r>
+      <w:r>
+        <w:t xml:space="preserve"> </w:t>
+      </w:r>
+      <w:r>
+        <w:rPr>
+          <w:b/>
+        </w:rPr>
+        <w:t xml:space="preserve">synthetic</w:t>
+      </w:r>
+      <w:r>
+        <w:t xml:space="preserve"> </w:t>
+      </w:r>
+      <w:r>
+        <w:t xml:space="preserve">demo by default; not a production job scheduler.</w:t>
+      </w:r>
+      <w:r>
+        <w:t xml:space="preserve"> </w:t>
+      </w:r>
+      <w:r>
+        <w:rPr>
+          <w:b/>
+        </w:rPr>
+        <w:t xml:space="preserve">Headless</w:t>
+      </w:r>
+      <w:r>
+        <w:t xml:space="preserve"> </w:t>
+      </w:r>
+      <w:r>
+        <w:t xml:space="preserve">runs may need</w:t>
+      </w:r>
+      <w:r>
+        <w:t xml:space="preserve"> </w:t>
+      </w:r>
+      <w:r>
+        <w:rPr>
+          <w:rStyle w:val="VerbatimChar"/>
+        </w:rPr>
+        <w:t xml:space="preserve">MPLBACKEND=Agg</w:t>
+      </w:r>
+      <w:r>
+        <w:t xml:space="preserve"> </w:t>
+      </w:r>
+      <w:r>
+        <w:t xml:space="preserve">(as in our wrapper).</w:t>
+      </w:r>
+      <w:r>
+        <w:t xml:space="preserve"> </w:t>
+      </w:r>
+      <w:r>
+        <w:rPr>
+          <w:b/>
+        </w:rPr>
+        <w:t xml:space="preserve">I/O</w:t>
+      </w:r>
+      <w:r>
+        <w:t xml:space="preserve"> </w:t>
+      </w:r>
+      <w:r>
+        <w:t xml:space="preserve">on shared filesystems can hurt large</w:t>
+      </w:r>
+      <w:r>
+        <w:t xml:space="preserve"> </w:t>
+      </w:r>
+      <w:r>
+        <w:rPr>
+          <w:b/>
+        </w:rPr>
+        <w:t xml:space="preserve">pickle</w:t>
+      </w:r>
+      <w:r>
+        <w:t xml:space="preserve"> </w:t>
+      </w:r>
+      <w:r>
+        <w:t xml:space="preserve">writes—these are</w:t>
+      </w:r>
+      <w:r>
+        <w:t xml:space="preserve"> </w:t>
+      </w:r>
+      <w:r>
+        <w:rPr>
+          <w:b/>
+        </w:rPr>
+        <w:t xml:space="preserve">deployment hygiene</w:t>
+      </w:r>
+      <w:r>
+        <w:t xml:space="preserve"> </w:t>
+      </w:r>
+      <w:r>
+        <w:t xml:space="preserve">observations, not central to scoring the</w:t>
+      </w:r>
+      <w:r>
+        <w:t xml:space="preserve"> </w:t>
+      </w:r>
+      <w:r>
+        <w:rPr>
+          <w:i/>
+        </w:rPr>
+        <w:t xml:space="preserve">article</w:t>
+      </w:r>
+      <w:r>
+        <w:t xml:space="preserve">.</w:t>
       </w:r>
     </w:p>
     <w:p>
@@ -2785,234 +3214,114 @@
       <w:pPr>
         <w:pStyle w:val="Heading2"/>
       </w:pPr>
-      <w:bookmarkStart w:id="38" w:name="commands-quick-reference"/>
-      <w:r>
-        <w:t xml:space="preserve">Commands (quick reference)</w:t>
-      </w:r>
-      <w:bookmarkEnd w:id="38"/>
-    </w:p>
-    <w:p>
-      <w:pPr>
-        <w:pStyle w:val="SourceCode"/>
-      </w:pPr>
-      <w:r>
-        <w:rPr>
-          <w:rStyle w:val="FunctionTok"/>
-        </w:rPr>
-        <w:t xml:space="preserve">chmod</w:t>
-      </w:r>
-      <w:r>
-        <w:rPr>
-          <w:rStyle w:val="NormalTok"/>
-        </w:rPr>
-        <w:t xml:space="preserve"> +x ./ebm          # once</w:t>
-      </w:r>
-      <w:r>
-        <w:br/>
-      </w:r>
-      <w:r>
-        <w:rPr>
-          <w:rStyle w:val="ExtensionTok"/>
-        </w:rPr>
-        <w:t xml:space="preserve">./ebm</w:t>
-      </w:r>
-      <w:r>
-        <w:rPr>
-          <w:rStyle w:val="NormalTok"/>
-        </w:rPr>
-        <w:t xml:space="preserve"> install           # venv + pip install (-e pySuStaIn + kde_ebm)</w:t>
-      </w:r>
-      <w:r>
-        <w:br/>
-      </w:r>
-      <w:r>
-        <w:rPr>
-          <w:rStyle w:val="ExtensionTok"/>
-        </w:rPr>
-        <w:t xml:space="preserve">./ebm</w:t>
-      </w:r>
-      <w:r>
-        <w:rPr>
-          <w:rStyle w:val="NormalTok"/>
-        </w:rPr>
-        <w:t xml:space="preserve"> check</w:t>
-      </w:r>
-      <w:r>
-        <w:br/>
-      </w:r>
-      <w:r>
-        <w:rPr>
-          <w:rStyle w:val="ExtensionTok"/>
-        </w:rPr>
-        <w:t xml:space="preserve">./ebm</w:t>
-      </w:r>
-      <w:r>
-        <w:rPr>
-          <w:rStyle w:val="NormalTok"/>
-        </w:rPr>
-        <w:t xml:space="preserve"> demo --output runs/demo --mcmc 8000</w:t>
-      </w:r>
-      <w:r>
-        <w:br/>
-      </w:r>
-      <w:r>
-        <w:rPr>
-          <w:rStyle w:val="ExtensionTok"/>
-        </w:rPr>
-        <w:t xml:space="preserve">./ebm</w:t>
-      </w:r>
-      <w:r>
-        <w:rPr>
-          <w:rStyle w:val="NormalTok"/>
-        </w:rPr>
-        <w:t xml:space="preserve"> fit cohort.csv --output runs/fit_out --group-col group --subject-col subject_id</w:t>
-      </w:r>
-      <w:r>
-        <w:br/>
-      </w:r>
-      <w:r>
-        <w:rPr>
-          <w:rStyle w:val="ExtensionTok"/>
-        </w:rPr>
-        <w:t xml:space="preserve">./ebm</w:t>
-      </w:r>
-      <w:r>
-        <w:rPr>
-          <w:rStyle w:val="NormalTok"/>
-        </w:rPr>
-        <w:t xml:space="preserve"> start             # background demo → .ebm/logs/fit.log</w:t>
-      </w:r>
-      <w:r>
-        <w:br/>
-      </w:r>
-      <w:r>
-        <w:rPr>
-          <w:rStyle w:val="ExtensionTok"/>
-        </w:rPr>
-        <w:t xml:space="preserve">./ebm</w:t>
-      </w:r>
-      <w:r>
-        <w:rPr>
-          <w:rStyle w:val="NormalTok"/>
-        </w:rPr>
-        <w:t xml:space="preserve"> logs -n 100</w:t>
-      </w:r>
-      <w:r>
-        <w:br/>
-      </w:r>
-      <w:r>
-        <w:rPr>
-          <w:rStyle w:val="ExtensionTok"/>
-        </w:rPr>
-        <w:t xml:space="preserve">./ebm</w:t>
-      </w:r>
-      <w:r>
-        <w:rPr>
-          <w:rStyle w:val="NormalTok"/>
-        </w:rPr>
-        <w:t xml:space="preserve"> stop</w:t>
-      </w:r>
+      <w:bookmarkStart w:id="40" w:name="builder-insight-synthesis-paper-in-focus"/>
+      <w:r>
+        <w:t xml:space="preserve">Builder insight (synthesis:</w:t>
+      </w:r>
+      <w:r>
+        <w:t xml:space="preserve"> </w:t>
+      </w:r>
+      <w:r>
+        <w:rPr>
+          <w:b/>
+        </w:rPr>
+        <w:t xml:space="preserve">paper</w:t>
+      </w:r>
+      <w:r>
+        <w:t xml:space="preserve"> </w:t>
+      </w:r>
+      <w:r>
+        <w:t xml:space="preserve">in focus)</w:t>
+      </w:r>
+      <w:bookmarkEnd w:id="40"/>
     </w:p>
     <w:p>
       <w:pPr>
         <w:pStyle w:val="FirstParagraph"/>
       </w:pPr>
       <w:r>
-        <w:rPr>
-          <w:b/>
-        </w:rPr>
-        <w:t xml:space="preserve">Outputs:</w:t>
-      </w:r>
-      <w:r>
-        <w:t xml:space="preserve"> </w:t>
-      </w:r>
-      <w:r>
-        <w:rPr>
-          <w:rStyle w:val="VerbatimChar"/>
-        </w:rPr>
-        <w:t xml:space="preserve">demo_stages.csv</w:t>
-      </w:r>
-      <w:r>
-        <w:t xml:space="preserve"> </w:t>
-      </w:r>
-      <w:r>
-        <w:t xml:space="preserve">/</w:t>
-      </w:r>
-      <w:r>
-        <w:t xml:space="preserve"> </w:t>
-      </w:r>
-      <w:r>
-        <w:rPr>
-          <w:rStyle w:val="VerbatimChar"/>
-        </w:rPr>
-        <w:t xml:space="preserve">*_stages.csv</w:t>
-      </w:r>
-      <w:r>
-        <w:t xml:space="preserve">,</w:t>
-      </w:r>
-      <w:r>
-        <w:t xml:space="preserve"> </w:t>
-      </w:r>
-      <w:r>
-        <w:rPr>
-          <w:rStyle w:val="VerbatimChar"/>
-        </w:rPr>
-        <w:t xml:space="preserve">demo_meta.json</w:t>
-      </w:r>
-      <w:r>
-        <w:t xml:space="preserve"> </w:t>
-      </w:r>
-      <w:r>
-        <w:t xml:space="preserve">/</w:t>
-      </w:r>
-      <w:r>
-        <w:t xml:space="preserve"> </w:t>
-      </w:r>
-      <w:r>
-        <w:rPr>
-          <w:rStyle w:val="VerbatimChar"/>
-        </w:rPr>
-        <w:t xml:space="preserve">fit_meta.json</w:t>
-      </w:r>
-      <w:r>
-        <w:t xml:space="preserve">,</w:t>
-      </w:r>
-      <w:r>
-        <w:t xml:space="preserve"> </w:t>
-      </w:r>
-      <w:r>
-        <w:rPr>
-          <w:rStyle w:val="VerbatimChar"/>
-          <w:b/>
-        </w:rPr>
-        <w:t xml:space="preserve">pickle_files/</w:t>
-      </w:r>
-      <w:r>
-        <w:t xml:space="preserve"> </w:t>
-      </w:r>
-      <w:r>
-        <w:t xml:space="preserve">under</w:t>
-      </w:r>
-      <w:r>
-        <w:t xml:space="preserve"> </w:t>
-      </w:r>
-      <w:r>
-        <w:rPr>
-          <w:rStyle w:val="VerbatimChar"/>
-        </w:rPr>
-        <w:t xml:space="preserve">--output</w:t>
-      </w:r>
-      <w:r>
-        <w:t xml:space="preserve">. Package version</w:t>
-      </w:r>
-      <w:r>
-        <w:t xml:space="preserve"> </w:t>
-      </w:r>
-      <w:r>
-        <w:rPr>
-          <w:b/>
-        </w:rPr>
-        <w:t xml:space="preserve">0.1.0</w:t>
+        <w:t xml:space="preserve">Lopez et al. give a defensible</w:t>
+      </w:r>
+      <w:r>
+        <w:t xml:space="preserve"> </w:t>
+      </w:r>
+      <w:r>
+        <w:rPr>
+          <w:b/>
+        </w:rPr>
+        <w:t xml:space="preserve">cross-sectional EBM</w:t>
+      </w:r>
+      <w:r>
+        <w:t xml:space="preserve"> </w:t>
+      </w:r>
+      <w:r>
+        <w:t xml:space="preserve">account on</w:t>
+      </w:r>
+      <w:r>
+        <w:t xml:space="preserve"> </w:t>
+      </w:r>
+      <w:r>
+        <w:rPr>
+          <w:b/>
+        </w:rPr>
+        <w:t xml:space="preserve">T1</w:t>
+      </w:r>
+      <w:r>
+        <w:t xml:space="preserve"> </w:t>
+      </w:r>
+      <w:r>
+        <w:t xml:space="preserve">morphometry in</w:t>
+      </w:r>
+      <w:r>
+        <w:t xml:space="preserve"> </w:t>
+      </w:r>
+      <w:r>
+        <w:rPr>
+          <w:b/>
+        </w:rPr>
+        <w:t xml:space="preserve">TLE</w:t>
+      </w:r>
+      <w:r>
+        <w:t xml:space="preserve"> </w:t>
+      </w:r>
+      <w:r>
+        <w:t xml:space="preserve">with a clear</w:t>
+      </w:r>
+      <w:r>
+        <w:t xml:space="preserve"> </w:t>
+      </w:r>
+      <w:r>
+        <w:rPr>
+          <w:b/>
+        </w:rPr>
+        <w:t xml:space="preserve">Stage 0</w:t>
+      </w:r>
+      <w:r>
+        <w:t xml:space="preserve"> </w:t>
+      </w:r>
+      <w:r>
+        <w:t xml:space="preserve">message and an honest discussion of</w:t>
+      </w:r>
+      <w:r>
+        <w:t xml:space="preserve"> </w:t>
+      </w:r>
+      <w:r>
+        <w:rPr>
+          <w:b/>
+        </w:rPr>
+        <w:t xml:space="preserve">limits vs. fine clinical staging</w:t>
+      </w:r>
+      <w:r>
+        <w:t xml:space="preserve">. The</w:t>
+      </w:r>
+      <w:r>
+        <w:t xml:space="preserve"> </w:t>
+      </w:r>
+      <w:r>
+        <w:rPr>
+          <w:b/>
+        </w:rPr>
+        <w:t xml:space="preserve">open stack</w:t>
       </w:r>
       <w:r>
         <w:t xml:space="preserve"> </w:t>
@@ -3024,28 +3333,192 @@
         <w:rPr>
           <w:rStyle w:val="VerbatimChar"/>
         </w:rPr>
-        <w:t xml:space="preserve">pyproject.toml</w:t>
-      </w:r>
-      <w:r>
-        <w:t xml:space="preserve">).</w:t>
-      </w:r>
-    </w:p>
-    <w:p>
-      <w:r>
-        <w:pict>
-          <v:rect style="width:0;height:1.5pt" o:hralign="center" o:hrstd="t" o:hr="t"/>
-        </w:pict>
-      </w:r>
-    </w:p>
-    <w:p>
-      <w:pPr>
-        <w:pStyle w:val="Heading2"/>
-      </w:pPr>
-      <w:bookmarkStart w:id="39" w:name="references-selected"/>
-      <w:r>
-        <w:t xml:space="preserve">References (selected)</w:t>
-      </w:r>
-      <w:bookmarkEnd w:id="39"/>
+        <w:t xml:space="preserve">kde_ebm</w:t>
+      </w:r>
+      <w:r>
+        <w:t xml:space="preserve"> </w:t>
+      </w:r>
+      <w:r>
+        <w:t xml:space="preserve">+</w:t>
+      </w:r>
+      <w:r>
+        <w:t xml:space="preserve"> </w:t>
+      </w:r>
+      <w:r>
+        <w:rPr>
+          <w:b/>
+        </w:rPr>
+        <w:t xml:space="preserve">MixtureSustain</w:t>
+      </w:r>
+      <w:r>
+        <w:t xml:space="preserve"> </w:t>
+      </w:r>
+      <w:r>
+        <w:t xml:space="preserve">/ pySuStaIn) is the one the</w:t>
+      </w:r>
+      <w:r>
+        <w:t xml:space="preserve"> </w:t>
+      </w:r>
+      <w:r>
+        <w:rPr>
+          <w:b/>
+        </w:rPr>
+        <w:t xml:space="preserve">publication</w:t>
+      </w:r>
+      <w:r>
+        <w:t xml:space="preserve">’s method story assumes; our</w:t>
+      </w:r>
+      <w:r>
+        <w:t xml:space="preserve"> </w:t>
+      </w:r>
+      <w:r>
+        <w:rPr>
+          <w:b/>
+        </w:rPr>
+        <w:t xml:space="preserve">small shell</w:t>
+      </w:r>
+      <w:r>
+        <w:t xml:space="preserve"> </w:t>
+      </w:r>
+      <w:r>
+        <w:t xml:space="preserve">was only to</w:t>
+      </w:r>
+      <w:r>
+        <w:t xml:space="preserve"> </w:t>
+      </w:r>
+      <w:r>
+        <w:rPr>
+          <w:b/>
+        </w:rPr>
+        <w:t xml:space="preserve">get hands on that same stack</w:t>
+      </w:r>
+      <w:r>
+        <w:t xml:space="preserve"> </w:t>
+      </w:r>
+      <w:r>
+        <w:t xml:space="preserve">to write this review, not to replace</w:t>
+      </w:r>
+      <w:r>
+        <w:t xml:space="preserve"> </w:t>
+      </w:r>
+      <w:r>
+        <w:rPr>
+          <w:b/>
+        </w:rPr>
+        <w:t xml:space="preserve">ENIGMA</w:t>
+      </w:r>
+      <w:r>
+        <w:t xml:space="preserve"> </w:t>
+      </w:r>
+      <w:r>
+        <w:t xml:space="preserve">feature work or the</w:t>
+      </w:r>
+      <w:r>
+        <w:t xml:space="preserve"> </w:t>
+      </w:r>
+      <w:r>
+        <w:rPr>
+          <w:b/>
+        </w:rPr>
+        <w:t xml:space="preserve">original study’s</w:t>
+      </w:r>
+      <w:r>
+        <w:t xml:space="preserve"> </w:t>
+      </w:r>
+      <w:r>
+        <w:t xml:space="preserve">validation. The real</w:t>
+      </w:r>
+      <w:r>
+        <w:t xml:space="preserve"> </w:t>
+      </w:r>
+      <w:r>
+        <w:rPr>
+          <w:b/>
+        </w:rPr>
+        <w:t xml:space="preserve">builder gap</w:t>
+      </w:r>
+      <w:r>
+        <w:t xml:space="preserve">—for the</w:t>
+      </w:r>
+      <w:r>
+        <w:t xml:space="preserve"> </w:t>
+      </w:r>
+      <w:r>
+        <w:rPr>
+          <w:i/>
+        </w:rPr>
+        <w:t xml:space="preserve">paper’s</w:t>
+      </w:r>
+      <w:r>
+        <w:t xml:space="preserve"> </w:t>
+      </w:r>
+      <w:r>
+        <w:t xml:space="preserve">use cases—is still</w:t>
+      </w:r>
+      <w:r>
+        <w:t xml:space="preserve"> </w:t>
+      </w:r>
+      <w:r>
+        <w:rPr>
+          <w:b/>
+        </w:rPr>
+        <w:t xml:space="preserve">biomarker tables, |</w:t>
+      </w:r>
+      <w:r>
+        <w:rPr>
+          <w:i/>
+          <w:b/>
+        </w:rPr>
+        <w:t xml:space="preserve">d</w:t>
+      </w:r>
+      <w:r>
+        <w:rPr>
+          <w:b/>
+        </w:rPr>
+        <w:t xml:space="preserve">| / screening, and biologically coherent staging interpretation</w:t>
+      </w:r>
+      <w:r>
+        <w:t xml:space="preserve">, not pip wiring alone.</w:t>
+      </w:r>
+    </w:p>
+    <w:p>
+      <w:pPr>
+        <w:pStyle w:val="BodyText"/>
+      </w:pPr>
+      <w:r>
+        <w:rPr>
+          <w:b/>
+        </w:rPr>
+        <w:t xml:space="preserve">If extending</w:t>
+      </w:r>
+      <w:r>
+        <w:rPr>
+          <w:b/>
+        </w:rPr>
+        <w:t xml:space="preserve"> </w:t>
+      </w:r>
+      <w:r>
+        <w:rPr>
+          <w:i/>
+          <w:b/>
+        </w:rPr>
+        <w:t xml:space="preserve">research plumbing</w:t>
+      </w:r>
+      <w:r>
+        <w:rPr>
+          <w:b/>
+        </w:rPr>
+        <w:t xml:space="preserve"> </w:t>
+      </w:r>
+      <w:r>
+        <w:rPr>
+          <w:b/>
+        </w:rPr>
+        <w:t xml:space="preserve">(optional; not a review of our repo as a product)</w:t>
+      </w:r>
+      <w:r>
+        <w:t xml:space="preserve">:</w:t>
+      </w:r>
     </w:p>
     <w:p>
       <w:pPr>
@@ -3056,79 +3529,73 @@
         <w:pStyle w:val="Compact"/>
       </w:pPr>
       <w:r>
-        <w:t xml:space="preserve">Lopez et al. 2022</w:t>
-      </w:r>
-      <w:r>
-        <w:t xml:space="preserve"> </w:t>
-      </w:r>
-      <w:r>
-        <w:rPr>
-          <w:i/>
-        </w:rPr>
-        <w:t xml:space="preserve">Epilepsia</w:t>
-      </w:r>
-      <w:r>
-        <w:t xml:space="preserve"> </w:t>
-      </w:r>
-      <w:r>
-        <w:t xml:space="preserve">— MTLE-HS KDE EBM (DOI above).</w:t>
-      </w:r>
-    </w:p>
-    <w:p>
-      <w:pPr>
-        <w:numPr>
-          <w:ilvl w:val="0"/>
-          <w:numId w:val="1015"/>
-        </w:numPr>
-        <w:pStyle w:val="Compact"/>
-      </w:pPr>
-      <w:r>
-        <w:rPr>
-          <w:rStyle w:val="VerbatimChar"/>
-        </w:rPr>
-        <w:t xml:space="preserve">EBM_TLE.md</w:t>
-      </w:r>
-      <w:r>
-        <w:t xml:space="preserve"> </w:t>
-      </w:r>
-      <w:r>
-        <w:t xml:space="preserve">— concise paper summary in this folder.</w:t>
-      </w:r>
-    </w:p>
-    <w:p>
-      <w:pPr>
-        <w:numPr>
-          <w:ilvl w:val="0"/>
-          <w:numId w:val="1015"/>
-        </w:numPr>
-        <w:pStyle w:val="Compact"/>
-      </w:pPr>
-      <w:r>
-        <w:t xml:space="preserve">pySuStaIn / kde_ebm — UCL POND tooling (installed via</w:t>
-      </w:r>
-      <w:r>
-        <w:t xml:space="preserve"> </w:t>
-      </w:r>
-      <w:r>
-        <w:rPr>
-          <w:rStyle w:val="VerbatimChar"/>
-        </w:rPr>
-        <w:t xml:space="preserve">requirements.txt</w:t>
-      </w:r>
-      <w:r>
-        <w:t xml:space="preserve">, GitHub).</w:t>
-      </w:r>
-    </w:p>
-    <w:p>
-      <w:pPr>
-        <w:numPr>
-          <w:ilvl w:val="0"/>
-          <w:numId w:val="1015"/>
-        </w:numPr>
-        <w:pStyle w:val="Compact"/>
-      </w:pPr>
-      <w:r>
-        <w:t xml:space="preserve">Builder Review criteria (local or internal docs) — full dimension list if needed for alignment with other reviews.</w:t>
+        <w:t xml:space="preserve">e.g. </w:t>
+      </w:r>
+      <w:r>
+        <w:rPr>
+          <w:rStyle w:val="VerbatimChar"/>
+        </w:rPr>
+        <w:t xml:space="preserve">examples/cohort_template.csv</w:t>
+      </w:r>
+      <w:r>
+        <w:t xml:space="preserve">,</w:t>
+      </w:r>
+      <w:r>
+        <w:t xml:space="preserve"> </w:t>
+      </w:r>
+      <w:r>
+        <w:rPr>
+          <w:rStyle w:val="VerbatimChar"/>
+        </w:rPr>
+        <w:t xml:space="preserve">Makefile</w:t>
+      </w:r>
+      <w:r>
+        <w:t xml:space="preserve"> </w:t>
+      </w:r>
+      <w:r>
+        <w:t xml:space="preserve">smoke</w:t>
+      </w:r>
+      <w:r>
+        <w:t xml:space="preserve"> </w:t>
+      </w:r>
+      <w:r>
+        <w:rPr>
+          <w:rStyle w:val="VerbatimChar"/>
+        </w:rPr>
+        <w:t xml:space="preserve">fit</w:t>
+      </w:r>
+      <w:r>
+        <w:t xml:space="preserve">,</w:t>
+      </w:r>
+      <w:r>
+        <w:t xml:space="preserve"> </w:t>
+      </w:r>
+      <w:r>
+        <w:rPr>
+          <w:b/>
+        </w:rPr>
+        <w:t xml:space="preserve">Slurm</w:t>
+      </w:r>
+      <w:r>
+        <w:t xml:space="preserve"> </w:t>
+      </w:r>
+      <w:r>
+        <w:t xml:space="preserve">wrappers for long jobs, or upstream</w:t>
+      </w:r>
+      <w:r>
+        <w:t xml:space="preserve"> </w:t>
+      </w:r>
+      <w:r>
+        <w:rPr>
+          <w:rStyle w:val="VerbatimChar"/>
+        </w:rPr>
+        <w:t xml:space="preserve">sim</w:t>
+      </w:r>
+      <w:r>
+        <w:t xml:space="preserve"> </w:t>
+      </w:r>
+      <w:r>
+        <w:t xml:space="preserve">import cleanups in pySuStaIn.</w:t>
       </w:r>
     </w:p>
     <w:p>
@@ -3140,13 +3607,383 @@
     </w:p>
     <w:p>
       <w:pPr>
+        <w:pStyle w:val="Heading2"/>
+      </w:pPr>
+      <w:bookmarkStart w:id="41" w:name="commands-appendix-local-grounding"/>
+      <w:r>
+        <w:t xml:space="preserve">Commands (appendix: local grounding)</w:t>
+      </w:r>
+      <w:bookmarkEnd w:id="41"/>
+    </w:p>
+    <w:p>
+      <w:pPr>
+        <w:pStyle w:val="SourceCode"/>
+      </w:pPr>
+      <w:r>
+        <w:rPr>
+          <w:rStyle w:val="FunctionTok"/>
+        </w:rPr>
+        <w:t xml:space="preserve">chmod</w:t>
+      </w:r>
+      <w:r>
+        <w:rPr>
+          <w:rStyle w:val="NormalTok"/>
+        </w:rPr>
+        <w:t xml:space="preserve"> +x ./ebm          # once</w:t>
+      </w:r>
+      <w:r>
+        <w:br/>
+      </w:r>
+      <w:r>
+        <w:rPr>
+          <w:rStyle w:val="ExtensionTok"/>
+        </w:rPr>
+        <w:t xml:space="preserve">./ebm</w:t>
+      </w:r>
+      <w:r>
+        <w:rPr>
+          <w:rStyle w:val="NormalTok"/>
+        </w:rPr>
+        <w:t xml:space="preserve"> install           # venv + pip install (-e pySuStaIn + kde_ebm)</w:t>
+      </w:r>
+      <w:r>
+        <w:br/>
+      </w:r>
+      <w:r>
+        <w:rPr>
+          <w:rStyle w:val="ExtensionTok"/>
+        </w:rPr>
+        <w:t xml:space="preserve">./ebm</w:t>
+      </w:r>
+      <w:r>
+        <w:rPr>
+          <w:rStyle w:val="NormalTok"/>
+        </w:rPr>
+        <w:t xml:space="preserve"> check</w:t>
+      </w:r>
+      <w:r>
+        <w:br/>
+      </w:r>
+      <w:r>
+        <w:rPr>
+          <w:rStyle w:val="ExtensionTok"/>
+        </w:rPr>
+        <w:t xml:space="preserve">./ebm</w:t>
+      </w:r>
+      <w:r>
+        <w:rPr>
+          <w:rStyle w:val="NormalTok"/>
+        </w:rPr>
+        <w:t xml:space="preserve"> demo --output runs/demo --mcmc 8000</w:t>
+      </w:r>
+      <w:r>
+        <w:br/>
+      </w:r>
+      <w:r>
+        <w:rPr>
+          <w:rStyle w:val="ExtensionTok"/>
+        </w:rPr>
+        <w:t xml:space="preserve">./ebm</w:t>
+      </w:r>
+      <w:r>
+        <w:rPr>
+          <w:rStyle w:val="NormalTok"/>
+        </w:rPr>
+        <w:t xml:space="preserve"> fit cohort.csv --output runs/fit_out --group-col group --subject-col subject_id</w:t>
+      </w:r>
+      <w:r>
+        <w:br/>
+      </w:r>
+      <w:r>
+        <w:rPr>
+          <w:rStyle w:val="ExtensionTok"/>
+        </w:rPr>
+        <w:t xml:space="preserve">./ebm</w:t>
+      </w:r>
+      <w:r>
+        <w:rPr>
+          <w:rStyle w:val="NormalTok"/>
+        </w:rPr>
+        <w:t xml:space="preserve"> start             # background demo → .ebm/logs/fit.log</w:t>
+      </w:r>
+      <w:r>
+        <w:br/>
+      </w:r>
+      <w:r>
+        <w:rPr>
+          <w:rStyle w:val="ExtensionTok"/>
+        </w:rPr>
+        <w:t xml:space="preserve">./ebm</w:t>
+      </w:r>
+      <w:r>
+        <w:rPr>
+          <w:rStyle w:val="NormalTok"/>
+        </w:rPr>
+        <w:t xml:space="preserve"> logs -n 100</w:t>
+      </w:r>
+      <w:r>
+        <w:br/>
+      </w:r>
+      <w:r>
+        <w:rPr>
+          <w:rStyle w:val="ExtensionTok"/>
+        </w:rPr>
+        <w:t xml:space="preserve">./ebm</w:t>
+      </w:r>
+      <w:r>
+        <w:rPr>
+          <w:rStyle w:val="NormalTok"/>
+        </w:rPr>
+        <w:t xml:space="preserve"> stop</w:t>
+      </w:r>
+    </w:p>
+    <w:p>
+      <w:pPr>
         <w:pStyle w:val="FirstParagraph"/>
       </w:pPr>
       <w:r>
         <w:rPr>
+          <w:b/>
+        </w:rPr>
+        <w:t xml:space="preserve">Outputs of that path:</w:t>
+      </w:r>
+      <w:r>
+        <w:t xml:space="preserve"> </w:t>
+      </w:r>
+      <w:r>
+        <w:t xml:space="preserve">e.g. </w:t>
+      </w:r>
+      <w:r>
+        <w:rPr>
+          <w:rStyle w:val="VerbatimChar"/>
+        </w:rPr>
+        <w:t xml:space="preserve">demo_stages.csv</w:t>
+      </w:r>
+      <w:r>
+        <w:t xml:space="preserve"> </w:t>
+      </w:r>
+      <w:r>
+        <w:t xml:space="preserve">/</w:t>
+      </w:r>
+      <w:r>
+        <w:t xml:space="preserve"> </w:t>
+      </w:r>
+      <w:r>
+        <w:rPr>
+          <w:rStyle w:val="VerbatimChar"/>
+        </w:rPr>
+        <w:t xml:space="preserve">*_stages.csv</w:t>
+      </w:r>
+      <w:r>
+        <w:t xml:space="preserve">,</w:t>
+      </w:r>
+      <w:r>
+        <w:t xml:space="preserve"> </w:t>
+      </w:r>
+      <w:r>
+        <w:rPr>
+          <w:rStyle w:val="VerbatimChar"/>
+        </w:rPr>
+        <w:t xml:space="preserve">demo_meta.json</w:t>
+      </w:r>
+      <w:r>
+        <w:t xml:space="preserve"> </w:t>
+      </w:r>
+      <w:r>
+        <w:t xml:space="preserve">/</w:t>
+      </w:r>
+      <w:r>
+        <w:t xml:space="preserve"> </w:t>
+      </w:r>
+      <w:r>
+        <w:rPr>
+          <w:rStyle w:val="VerbatimChar"/>
+        </w:rPr>
+        <w:t xml:space="preserve">fit_meta.json</w:t>
+      </w:r>
+      <w:r>
+        <w:t xml:space="preserve">,</w:t>
+      </w:r>
+      <w:r>
+        <w:t xml:space="preserve"> </w:t>
+      </w:r>
+      <w:r>
+        <w:rPr>
+          <w:rStyle w:val="VerbatimChar"/>
+        </w:rPr>
+        <w:t xml:space="preserve">pickle_files/</w:t>
+      </w:r>
+      <w:r>
+        <w:t xml:space="preserve"> </w:t>
+      </w:r>
+      <w:r>
+        <w:t xml:space="preserve">under</w:t>
+      </w:r>
+      <w:r>
+        <w:t xml:space="preserve"> </w:t>
+      </w:r>
+      <w:r>
+        <w:rPr>
+          <w:rStyle w:val="VerbatimChar"/>
+        </w:rPr>
+        <w:t xml:space="preserve">--output</w:t>
+      </w:r>
+      <w:r>
+        <w:t xml:space="preserve"> </w:t>
+      </w:r>
+      <w:r>
+        <w:t xml:space="preserve">(see</w:t>
+      </w:r>
+      <w:r>
+        <w:t xml:space="preserve"> </w:t>
+      </w:r>
+      <w:r>
+        <w:rPr>
+          <w:rStyle w:val="VerbatimChar"/>
+        </w:rPr>
+        <w:t xml:space="preserve">pyproject.toml</w:t>
+      </w:r>
+      <w:r>
+        <w:t xml:space="preserve"> </w:t>
+      </w:r>
+      <w:r>
+        <w:t xml:space="preserve">for version).</w:t>
+      </w:r>
+    </w:p>
+    <w:p>
+      <w:r>
+        <w:pict>
+          <v:rect style="width:0;height:1.5pt" o:hralign="center" o:hrstd="t" o:hr="t"/>
+        </w:pict>
+      </w:r>
+    </w:p>
+    <w:p>
+      <w:pPr>
+        <w:pStyle w:val="Heading2"/>
+      </w:pPr>
+      <w:bookmarkStart w:id="42" w:name="references-selected"/>
+      <w:r>
+        <w:t xml:space="preserve">References (selected)</w:t>
+      </w:r>
+      <w:bookmarkEnd w:id="42"/>
+    </w:p>
+    <w:p>
+      <w:pPr>
+        <w:numPr>
+          <w:ilvl w:val="0"/>
+          <w:numId w:val="1016"/>
+        </w:numPr>
+        <w:pStyle w:val="Compact"/>
+      </w:pPr>
+      <w:r>
+        <w:t xml:space="preserve">Lopez et al. 2022</w:t>
+      </w:r>
+      <w:r>
+        <w:t xml:space="preserve"> </w:t>
+      </w:r>
+      <w:r>
+        <w:rPr>
           <w:i/>
         </w:rPr>
-        <w:t xml:space="preserve">Last updated: 2026-04-14.</w:t>
+        <w:t xml:space="preserve">Epilepsia</w:t>
+      </w:r>
+      <w:r>
+        <w:t xml:space="preserve"> </w:t>
+      </w:r>
+      <w:r>
+        <w:t xml:space="preserve">— MTLE-HS KDE EBM (DOI above).</w:t>
+      </w:r>
+    </w:p>
+    <w:p>
+      <w:pPr>
+        <w:numPr>
+          <w:ilvl w:val="0"/>
+          <w:numId w:val="1016"/>
+        </w:numPr>
+        <w:pStyle w:val="Compact"/>
+      </w:pPr>
+      <w:hyperlink r:id="rId24">
+        <w:r>
+          <w:rPr>
+            <w:rStyle w:val="Hyperlink"/>
+          </w:rPr>
+          <w:t xml:space="preserve">EBM_TLE.md</w:t>
+        </w:r>
+      </w:hyperlink>
+      <w:r>
+        <w:t xml:space="preserve"> </w:t>
+      </w:r>
+      <w:r>
+        <w:t xml:space="preserve">— short paper summary in this folder.</w:t>
+      </w:r>
+    </w:p>
+    <w:p>
+      <w:pPr>
+        <w:numPr>
+          <w:ilvl w:val="0"/>
+          <w:numId w:val="1016"/>
+        </w:numPr>
+        <w:pStyle w:val="Compact"/>
+      </w:pPr>
+      <w:r>
+        <w:t xml:space="preserve">pySuStaIn / kde_ebm — UCL POND tooling (via</w:t>
+      </w:r>
+      <w:r>
+        <w:t xml:space="preserve"> </w:t>
+      </w:r>
+      <w:r>
+        <w:rPr>
+          <w:rStyle w:val="VerbatimChar"/>
+        </w:rPr>
+        <w:t xml:space="preserve">requirements.txt</w:t>
+      </w:r>
+      <w:r>
+        <w:t xml:space="preserve">, GitHub).</w:t>
+      </w:r>
+    </w:p>
+    <w:p>
+      <w:pPr>
+        <w:numPr>
+          <w:ilvl w:val="0"/>
+          <w:numId w:val="1016"/>
+        </w:numPr>
+        <w:pStyle w:val="Compact"/>
+      </w:pPr>
+      <w:r>
+        <w:t xml:space="preserve">Builder Review criteria (local or internal) — for alignment with other</w:t>
+      </w:r>
+      <w:r>
+        <w:t xml:space="preserve"> </w:t>
+      </w:r>
+      <w:r>
+        <w:rPr>
+          <w:i/>
+        </w:rPr>
+        <w:t xml:space="preserve">paper</w:t>
+      </w:r>
+      <w:r>
+        <w:t xml:space="preserve"> </w:t>
+      </w:r>
+      <w:r>
+        <w:t xml:space="preserve">reviews in this style.</w:t>
+      </w:r>
+    </w:p>
+    <w:p>
+      <w:r>
+        <w:pict>
+          <v:rect style="width:0;height:1.5pt" o:hralign="center" o:hrstd="t" o:hr="t"/>
+        </w:pict>
+      </w:r>
+    </w:p>
+    <w:p>
+      <w:pPr>
+        <w:pStyle w:val="FirstParagraph"/>
+      </w:pPr>
+      <w:r>
+        <w:rPr>
+          <w:i/>
+        </w:rPr>
+        <w:t xml:space="preserve">Last updated: 2026-04-24.</w:t>
       </w:r>
     </w:p>
     <w:sectPr/>
@@ -3431,6 +4268,9 @@
     <w:abstractNumId w:val="991"/>
   </w:num>
   <w:num w:numId="1015">
+    <w:abstractNumId w:val="991"/>
+  </w:num>
+  <w:num w:numId="1016">
     <w:abstractNumId w:val="991"/>
   </w:num>
 </w:numbering>

</xml_diff>